<commit_message>
Aula de Banco de Dados 1
</commit_message>
<xml_diff>
--- a/Banco de Dados.docx
+++ b/Banco de Dados.docx
@@ -383,15 +383,86 @@
           <w:b/>
           <w:sz w:val="24"/>
         </w:rPr>
-        <w:t xml:space="preserve">SGBD </w:t>
-      </w:r>
+        <w:t>SGBD (Sistema Gerenciador de Banco de Dados)</w:t>
+      </w:r>
+    </w:p>
+    <w:p>
+      <w:pPr>
+        <w:pStyle w:val="PargrafodaLista"/>
+        <w:numPr>
+          <w:ilvl w:val="0"/>
+          <w:numId w:val="3"/>
+        </w:numPr>
+        <w:rPr>
+          <w:rFonts w:ascii="Times New Roman" w:hAnsi="Times New Roman" w:cs="Times New Roman"/>
+        </w:rPr>
+      </w:pPr>
+      <w:r>
+        <w:rPr>
+          <w:rFonts w:ascii="Times New Roman" w:hAnsi="Times New Roman" w:cs="Times New Roman"/>
+        </w:rPr>
+        <w:t xml:space="preserve">São uma coleção de softwares que permite aos usuários criarem e manterem um ou mais banco de dados </w:t>
+      </w:r>
+    </w:p>
+    <w:p>
+      <w:pPr>
+        <w:pStyle w:val="PargrafodaLista"/>
+        <w:numPr>
+          <w:ilvl w:val="0"/>
+          <w:numId w:val="3"/>
+        </w:numPr>
+        <w:rPr>
+          <w:rFonts w:ascii="Times New Roman" w:hAnsi="Times New Roman" w:cs="Times New Roman"/>
+        </w:rPr>
+      </w:pPr>
+      <w:r>
+        <w:rPr>
+          <w:rFonts w:ascii="Times New Roman" w:hAnsi="Times New Roman" w:cs="Times New Roman"/>
+        </w:rPr>
+        <w:t>Permite proteger o banco de dados e mantê-lo a longo prazo</w:t>
+      </w:r>
+    </w:p>
+    <w:p>
+      <w:pPr>
+        <w:pStyle w:val="PargrafodaLista"/>
+        <w:numPr>
+          <w:ilvl w:val="0"/>
+          <w:numId w:val="3"/>
+        </w:numPr>
+        <w:rPr>
+          <w:rFonts w:ascii="Times New Roman" w:hAnsi="Times New Roman" w:cs="Times New Roman"/>
+        </w:rPr>
+      </w:pPr>
+      <w:r>
+        <w:rPr>
+          <w:rFonts w:ascii="Times New Roman" w:hAnsi="Times New Roman" w:cs="Times New Roman"/>
+        </w:rPr>
+        <w:t>Permitem a realização de tarefas com compartilhamento dos DB entre usuários e aplicação</w:t>
+      </w:r>
+    </w:p>
+    <w:p>
+      <w:pPr>
+        <w:ind w:left="360"/>
+        <w:rPr>
+          <w:rFonts w:ascii="Times New Roman" w:hAnsi="Times New Roman" w:cs="Times New Roman"/>
+        </w:rPr>
+      </w:pPr>
+    </w:p>
+    <w:p>
+      <w:pPr>
+        <w:ind w:left="360"/>
+        <w:rPr>
+          <w:rFonts w:ascii="Times New Roman" w:hAnsi="Times New Roman" w:cs="Times New Roman"/>
+          <w:b/>
+        </w:rPr>
+      </w:pPr>
       <w:r>
         <w:rPr>
           <w:rFonts w:ascii="Times New Roman" w:hAnsi="Times New Roman" w:cs="Times New Roman"/>
           <w:b/>
           <w:sz w:val="24"/>
         </w:rPr>
-        <w:t>(Sistema Gerenciador de Banco de Dados)</w:t>
+        <w:t>Características e Funcionalidades</w:t>
       </w:r>
     </w:p>
     <w:p>
@@ -399,17 +470,17 @@
         <w:pStyle w:val="PargrafodaLista"/>
         <w:numPr>
           <w:ilvl w:val="0"/>
-          <w:numId w:val="3"/>
-        </w:numPr>
-        <w:rPr>
-          <w:rFonts w:ascii="Times New Roman" w:hAnsi="Times New Roman" w:cs="Times New Roman"/>
-        </w:rPr>
-      </w:pPr>
-      <w:r>
-        <w:rPr>
-          <w:rFonts w:ascii="Times New Roman" w:hAnsi="Times New Roman" w:cs="Times New Roman"/>
-        </w:rPr>
-        <w:t xml:space="preserve">São uma coleção de softwares que permite aos usuários criarem e manterem um ou mais banco de dados </w:t>
+          <w:numId w:val="2"/>
+        </w:numPr>
+        <w:rPr>
+          <w:rFonts w:ascii="Times New Roman" w:hAnsi="Times New Roman" w:cs="Times New Roman"/>
+        </w:rPr>
+      </w:pPr>
+      <w:r>
+        <w:rPr>
+          <w:rFonts w:ascii="Times New Roman" w:hAnsi="Times New Roman" w:cs="Times New Roman"/>
+        </w:rPr>
+        <w:t>Controle de Redundância</w:t>
       </w:r>
     </w:p>
     <w:p>
@@ -417,17 +488,18 @@
         <w:pStyle w:val="PargrafodaLista"/>
         <w:numPr>
           <w:ilvl w:val="0"/>
-          <w:numId w:val="3"/>
-        </w:numPr>
-        <w:rPr>
-          <w:rFonts w:ascii="Times New Roman" w:hAnsi="Times New Roman" w:cs="Times New Roman"/>
-        </w:rPr>
-      </w:pPr>
-      <w:r>
-        <w:rPr>
-          <w:rFonts w:ascii="Times New Roman" w:hAnsi="Times New Roman" w:cs="Times New Roman"/>
-        </w:rPr>
-        <w:t>Permite proteger o banco de dados e mantê-lo a longo prazo</w:t>
+          <w:numId w:val="2"/>
+        </w:numPr>
+        <w:rPr>
+          <w:rFonts w:ascii="Times New Roman" w:hAnsi="Times New Roman" w:cs="Times New Roman"/>
+        </w:rPr>
+      </w:pPr>
+      <w:r>
+        <w:rPr>
+          <w:rFonts w:ascii="Times New Roman" w:hAnsi="Times New Roman" w:cs="Times New Roman"/>
+        </w:rPr>
+        <w:lastRenderedPageBreak/>
+        <w:t>Múltiplas Visões dos dados</w:t>
       </w:r>
     </w:p>
     <w:p>
@@ -435,376 +507,872 @@
         <w:pStyle w:val="PargrafodaLista"/>
         <w:numPr>
           <w:ilvl w:val="0"/>
-          <w:numId w:val="3"/>
-        </w:numPr>
-        <w:rPr>
-          <w:rFonts w:ascii="Times New Roman" w:hAnsi="Times New Roman" w:cs="Times New Roman"/>
-        </w:rPr>
-      </w:pPr>
-      <w:r>
-        <w:rPr>
-          <w:rFonts w:ascii="Times New Roman" w:hAnsi="Times New Roman" w:cs="Times New Roman"/>
-        </w:rPr>
-        <w:t>Permitem a realização de tarefas com compartilhamento dos DB entre usuários e aplicação</w:t>
-      </w:r>
-    </w:p>
-    <w:p>
-      <w:pPr>
-        <w:ind w:left="360"/>
-        <w:rPr>
-          <w:rFonts w:ascii="Times New Roman" w:hAnsi="Times New Roman" w:cs="Times New Roman"/>
-        </w:rPr>
-      </w:pPr>
-    </w:p>
-    <w:p>
-      <w:pPr>
-        <w:ind w:left="360"/>
-        <w:rPr>
-          <w:rFonts w:ascii="Times New Roman" w:hAnsi="Times New Roman" w:cs="Times New Roman"/>
-          <w:b/>
-        </w:rPr>
-      </w:pPr>
-      <w:r>
+          <w:numId w:val="2"/>
+        </w:numPr>
+        <w:rPr>
+          <w:rFonts w:ascii="Times New Roman" w:hAnsi="Times New Roman" w:cs="Times New Roman"/>
+        </w:rPr>
+      </w:pPr>
+      <w:r>
+        <w:rPr>
+          <w:rFonts w:ascii="Times New Roman" w:hAnsi="Times New Roman" w:cs="Times New Roman"/>
+        </w:rPr>
+        <w:t>Controle de concorrência</w:t>
+      </w:r>
+    </w:p>
+    <w:p>
+      <w:pPr>
+        <w:pStyle w:val="PargrafodaLista"/>
+        <w:numPr>
+          <w:ilvl w:val="0"/>
+          <w:numId w:val="2"/>
+        </w:numPr>
+        <w:rPr>
+          <w:rFonts w:ascii="Times New Roman" w:hAnsi="Times New Roman" w:cs="Times New Roman"/>
+        </w:rPr>
+      </w:pPr>
+      <w:r>
+        <w:rPr>
+          <w:rFonts w:ascii="Times New Roman" w:hAnsi="Times New Roman" w:cs="Times New Roman"/>
+        </w:rPr>
+        <w:t>Backup e Restauração</w:t>
+      </w:r>
+    </w:p>
+    <w:p>
+      <w:pPr>
+        <w:pStyle w:val="PargrafodaLista"/>
+        <w:numPr>
+          <w:ilvl w:val="0"/>
+          <w:numId w:val="2"/>
+        </w:numPr>
+        <w:rPr>
+          <w:rFonts w:ascii="Times New Roman" w:hAnsi="Times New Roman" w:cs="Times New Roman"/>
+        </w:rPr>
+      </w:pPr>
+      <w:r>
+        <w:rPr>
+          <w:rFonts w:ascii="Times New Roman" w:hAnsi="Times New Roman" w:cs="Times New Roman"/>
+        </w:rPr>
+        <w:t>Autenticação e Autorização de acesso</w:t>
+      </w:r>
+    </w:p>
+    <w:p>
+      <w:pPr>
+        <w:pStyle w:val="PargrafodaLista"/>
+        <w:numPr>
+          <w:ilvl w:val="0"/>
+          <w:numId w:val="2"/>
+        </w:numPr>
+        <w:rPr>
+          <w:rFonts w:ascii="Times New Roman" w:hAnsi="Times New Roman" w:cs="Times New Roman"/>
+        </w:rPr>
+      </w:pPr>
+      <w:r>
+        <w:rPr>
+          <w:rFonts w:ascii="Times New Roman" w:hAnsi="Times New Roman" w:cs="Times New Roman"/>
+        </w:rPr>
+        <w:t>Restrições de Integridade</w:t>
+      </w:r>
+    </w:p>
+    <w:p>
+      <w:pPr>
+        <w:rPr>
+          <w:rFonts w:ascii="Times New Roman" w:hAnsi="Times New Roman" w:cs="Times New Roman"/>
+        </w:rPr>
+      </w:pPr>
+    </w:p>
+    <w:p>
+      <w:pPr>
         <w:rPr>
           <w:rFonts w:ascii="Times New Roman" w:hAnsi="Times New Roman" w:cs="Times New Roman"/>
           <w:b/>
           <w:sz w:val="24"/>
         </w:rPr>
-        <w:t>Características e Funcionalidades</w:t>
-      </w:r>
-    </w:p>
-    <w:p>
-      <w:pPr>
-        <w:pStyle w:val="PargrafodaLista"/>
-        <w:numPr>
-          <w:ilvl w:val="0"/>
-          <w:numId w:val="2"/>
-        </w:numPr>
-        <w:rPr>
-          <w:rFonts w:ascii="Times New Roman" w:hAnsi="Times New Roman" w:cs="Times New Roman"/>
-        </w:rPr>
-      </w:pPr>
-      <w:r>
-        <w:rPr>
-          <w:rFonts w:ascii="Times New Roman" w:hAnsi="Times New Roman" w:cs="Times New Roman"/>
-        </w:rPr>
-        <w:t>Controle de Redundância</w:t>
-      </w:r>
-    </w:p>
-    <w:p>
-      <w:pPr>
-        <w:pStyle w:val="PargrafodaLista"/>
-        <w:numPr>
-          <w:ilvl w:val="0"/>
-          <w:numId w:val="2"/>
-        </w:numPr>
-        <w:rPr>
-          <w:rFonts w:ascii="Times New Roman" w:hAnsi="Times New Roman" w:cs="Times New Roman"/>
-        </w:rPr>
-      </w:pPr>
-      <w:r>
-        <w:rPr>
-          <w:rFonts w:ascii="Times New Roman" w:hAnsi="Times New Roman" w:cs="Times New Roman"/>
-        </w:rPr>
-        <w:lastRenderedPageBreak/>
-        <w:t>Múltiplas Visões dos dados</w:t>
-      </w:r>
-    </w:p>
-    <w:p>
-      <w:pPr>
-        <w:pStyle w:val="PargrafodaLista"/>
-        <w:numPr>
-          <w:ilvl w:val="0"/>
-          <w:numId w:val="2"/>
-        </w:numPr>
-        <w:rPr>
-          <w:rFonts w:ascii="Times New Roman" w:hAnsi="Times New Roman" w:cs="Times New Roman"/>
-        </w:rPr>
-      </w:pPr>
-      <w:r>
-        <w:rPr>
-          <w:rFonts w:ascii="Times New Roman" w:hAnsi="Times New Roman" w:cs="Times New Roman"/>
-        </w:rPr>
-        <w:t>Controle de concorrência</w:t>
-      </w:r>
-    </w:p>
-    <w:p>
-      <w:pPr>
-        <w:pStyle w:val="PargrafodaLista"/>
-        <w:numPr>
-          <w:ilvl w:val="0"/>
-          <w:numId w:val="2"/>
-        </w:numPr>
-        <w:rPr>
-          <w:rFonts w:ascii="Times New Roman" w:hAnsi="Times New Roman" w:cs="Times New Roman"/>
-        </w:rPr>
-      </w:pPr>
-      <w:r>
-        <w:rPr>
-          <w:rFonts w:ascii="Times New Roman" w:hAnsi="Times New Roman" w:cs="Times New Roman"/>
-        </w:rPr>
-        <w:t>Backup e Restauração</w:t>
-      </w:r>
-    </w:p>
-    <w:p>
-      <w:pPr>
-        <w:pStyle w:val="PargrafodaLista"/>
-        <w:numPr>
-          <w:ilvl w:val="0"/>
-          <w:numId w:val="2"/>
-        </w:numPr>
-        <w:rPr>
-          <w:rFonts w:ascii="Times New Roman" w:hAnsi="Times New Roman" w:cs="Times New Roman"/>
-        </w:rPr>
-      </w:pPr>
-      <w:r>
-        <w:rPr>
-          <w:rFonts w:ascii="Times New Roman" w:hAnsi="Times New Roman" w:cs="Times New Roman"/>
-        </w:rPr>
-        <w:t>Autenticação e Autorização de acesso</w:t>
-      </w:r>
-    </w:p>
-    <w:p>
-      <w:pPr>
-        <w:pStyle w:val="PargrafodaLista"/>
-        <w:numPr>
-          <w:ilvl w:val="0"/>
-          <w:numId w:val="2"/>
-        </w:numPr>
-        <w:rPr>
-          <w:rFonts w:ascii="Times New Roman" w:hAnsi="Times New Roman" w:cs="Times New Roman"/>
-        </w:rPr>
-      </w:pPr>
-      <w:r>
-        <w:rPr>
-          <w:rFonts w:ascii="Times New Roman" w:hAnsi="Times New Roman" w:cs="Times New Roman"/>
-        </w:rPr>
-        <w:t>Restrições de Integridade</w:t>
-      </w:r>
-    </w:p>
-    <w:p>
-      <w:pPr>
-        <w:rPr>
-          <w:rFonts w:ascii="Times New Roman" w:hAnsi="Times New Roman" w:cs="Times New Roman"/>
-        </w:rPr>
-      </w:pPr>
-    </w:p>
-    <w:p>
-      <w:pPr>
+      </w:pPr>
+      <w:r>
         <w:rPr>
           <w:rFonts w:ascii="Times New Roman" w:hAnsi="Times New Roman" w:cs="Times New Roman"/>
           <w:b/>
           <w:sz w:val="24"/>
         </w:rPr>
-      </w:pPr>
-      <w:r>
+        <w:t>Funções de um SGBD</w:t>
+      </w:r>
+    </w:p>
+    <w:p>
+      <w:pPr>
+        <w:rPr>
+          <w:rFonts w:ascii="Times New Roman" w:hAnsi="Times New Roman" w:cs="Times New Roman"/>
+        </w:rPr>
+      </w:pPr>
+      <w:r>
+        <w:rPr>
+          <w:rFonts w:ascii="Times New Roman" w:hAnsi="Times New Roman" w:cs="Times New Roman"/>
+        </w:rPr>
+        <w:t>Inserir, excluir, acessar, visualizar</w:t>
+      </w:r>
+    </w:p>
+    <w:p>
+      <w:pPr>
+        <w:rPr>
+          <w:rFonts w:ascii="Times New Roman" w:hAnsi="Times New Roman" w:cs="Times New Roman"/>
+        </w:rPr>
+      </w:pPr>
+    </w:p>
+    <w:p>
+      <w:pPr>
+        <w:rPr>
+          <w:rFonts w:ascii="Times New Roman" w:hAnsi="Times New Roman" w:cs="Times New Roman"/>
+        </w:rPr>
+      </w:pPr>
+    </w:p>
+    <w:p>
+      <w:pPr>
+        <w:rPr>
+          <w:rFonts w:ascii="Times New Roman" w:hAnsi="Times New Roman" w:cs="Times New Roman"/>
+        </w:rPr>
+      </w:pPr>
+    </w:p>
+    <w:p>
+      <w:pPr>
+        <w:rPr>
+          <w:rFonts w:ascii="Times New Roman" w:hAnsi="Times New Roman" w:cs="Times New Roman"/>
+        </w:rPr>
+      </w:pPr>
+    </w:p>
+    <w:p>
+      <w:pPr>
+        <w:rPr>
+          <w:rFonts w:ascii="Times New Roman" w:hAnsi="Times New Roman" w:cs="Times New Roman"/>
+        </w:rPr>
+      </w:pPr>
+      <w:r>
+        <w:rPr>
+          <w:rFonts w:ascii="Times New Roman" w:hAnsi="Times New Roman" w:cs="Times New Roman"/>
+        </w:rPr>
+        <w:t>Modelos de Banco de Dados</w:t>
+      </w:r>
+    </w:p>
+    <w:p>
+      <w:pPr>
+        <w:rPr>
+          <w:rFonts w:ascii="Times New Roman" w:hAnsi="Times New Roman" w:cs="Times New Roman"/>
+        </w:rPr>
+      </w:pPr>
+      <w:r>
+        <w:rPr>
+          <w:rFonts w:ascii="Times New Roman" w:hAnsi="Times New Roman" w:cs="Times New Roman"/>
+        </w:rPr>
+        <w:t>Modelo Hierárquico</w:t>
+      </w:r>
+    </w:p>
+    <w:p>
+      <w:pPr>
+        <w:rPr>
+          <w:rFonts w:ascii="Times New Roman" w:hAnsi="Times New Roman" w:cs="Times New Roman"/>
+        </w:rPr>
+      </w:pPr>
+      <w:r>
+        <w:rPr>
+          <w:rFonts w:ascii="Times New Roman" w:hAnsi="Times New Roman" w:cs="Times New Roman"/>
+        </w:rPr>
+        <w:t>Neste model</w:t>
+      </w:r>
+      <w:r>
+        <w:rPr>
+          <w:rFonts w:ascii="Times New Roman" w:hAnsi="Times New Roman" w:cs="Times New Roman"/>
+        </w:rPr>
+        <w:t>o</w:t>
+      </w:r>
+      <w:r>
+        <w:rPr>
+          <w:rFonts w:ascii="Times New Roman" w:hAnsi="Times New Roman" w:cs="Times New Roman"/>
+        </w:rPr>
+        <w:t>, os dados são organizados de forma hierárquica</w:t>
+      </w:r>
+    </w:p>
+    <w:p>
+      <w:pPr>
+        <w:rPr>
+          <w:rFonts w:ascii="Times New Roman" w:hAnsi="Times New Roman" w:cs="Times New Roman"/>
+        </w:rPr>
+      </w:pPr>
+    </w:p>
+    <w:p>
+      <w:pPr>
+        <w:rPr>
+          <w:rFonts w:ascii="Times New Roman" w:hAnsi="Times New Roman" w:cs="Times New Roman"/>
+        </w:rPr>
+      </w:pPr>
+    </w:p>
+    <w:p>
+      <w:pPr>
+        <w:rPr>
+          <w:rFonts w:ascii="Times New Roman" w:hAnsi="Times New Roman" w:cs="Times New Roman"/>
+        </w:rPr>
+      </w:pPr>
+    </w:p>
+    <w:p>
+      <w:pPr>
+        <w:rPr>
+          <w:rFonts w:ascii="Times New Roman" w:hAnsi="Times New Roman" w:cs="Times New Roman"/>
+        </w:rPr>
+      </w:pPr>
+      <w:r>
+        <w:rPr>
+          <w:rFonts w:ascii="Times New Roman" w:hAnsi="Times New Roman" w:cs="Times New Roman"/>
+        </w:rPr>
+        <w:t>Modelagem de Dados (Modelo Relaciona)</w:t>
+      </w:r>
+    </w:p>
+    <w:p>
+      <w:pPr>
+        <w:rPr>
+          <w:rFonts w:ascii="Times New Roman" w:hAnsi="Times New Roman" w:cs="Times New Roman"/>
+        </w:rPr>
+      </w:pPr>
+      <w:r>
+        <w:rPr>
+          <w:rFonts w:ascii="Times New Roman" w:hAnsi="Times New Roman" w:cs="Times New Roman"/>
+        </w:rPr>
+        <w:t>DER: Diagrama Entidade Relacionamento</w:t>
+      </w:r>
+      <w:r>
+        <w:rPr>
+          <w:rFonts w:ascii="Times New Roman" w:hAnsi="Times New Roman" w:cs="Times New Roman"/>
+        </w:rPr>
+        <w:t xml:space="preserve"> </w:t>
+      </w:r>
+      <w:r>
+        <w:rPr>
+          <w:rFonts w:ascii="Times New Roman" w:hAnsi="Times New Roman" w:cs="Times New Roman"/>
+        </w:rPr>
+        <w:t>(gráficos)</w:t>
+      </w:r>
+    </w:p>
+    <w:p>
+      <w:pPr>
+        <w:rPr>
+          <w:rFonts w:ascii="Times New Roman" w:hAnsi="Times New Roman" w:cs="Times New Roman"/>
+        </w:rPr>
+      </w:pPr>
+      <w:r>
+        <w:rPr>
+          <w:rFonts w:ascii="Times New Roman" w:hAnsi="Times New Roman" w:cs="Times New Roman"/>
+        </w:rPr>
+        <w:t xml:space="preserve">MER: Modelo Entidade Relacional </w:t>
+      </w:r>
+    </w:p>
+    <w:p>
+      <w:pPr>
+        <w:rPr>
+          <w:rFonts w:ascii="Times New Roman" w:hAnsi="Times New Roman" w:cs="Times New Roman"/>
+        </w:rPr>
+      </w:pPr>
+    </w:p>
+    <w:p>
+      <w:pPr>
+        <w:rPr>
+          <w:rFonts w:ascii="Times New Roman" w:hAnsi="Times New Roman" w:cs="Times New Roman"/>
+          <w:b/>
+        </w:rPr>
+      </w:pPr>
+      <w:r>
+        <w:rPr>
+          <w:rFonts w:ascii="Times New Roman" w:hAnsi="Times New Roman" w:cs="Times New Roman"/>
+          <w:b/>
+        </w:rPr>
+        <w:t>Entidade e relacionamento (entre tabelas)</w:t>
+      </w:r>
+    </w:p>
+    <w:p>
+      <w:pPr>
+        <w:ind w:left="708"/>
+        <w:rPr>
+          <w:rFonts w:ascii="Times New Roman" w:hAnsi="Times New Roman" w:cs="Times New Roman"/>
+        </w:rPr>
+      </w:pPr>
+      <w:r>
+        <w:rPr>
+          <w:rFonts w:ascii="Times New Roman" w:hAnsi="Times New Roman" w:cs="Times New Roman"/>
+        </w:rPr>
+        <w:t>Fases de Desenvolvimento:</w:t>
+      </w:r>
+    </w:p>
+    <w:p>
+      <w:pPr>
+        <w:pStyle w:val="PargrafodaLista"/>
+        <w:numPr>
+          <w:ilvl w:val="0"/>
+          <w:numId w:val="4"/>
+        </w:numPr>
+        <w:rPr>
+          <w:rFonts w:ascii="Times New Roman" w:hAnsi="Times New Roman" w:cs="Times New Roman"/>
+        </w:rPr>
+      </w:pPr>
+      <w:r>
+        <w:rPr>
+          <w:rFonts w:ascii="Times New Roman" w:hAnsi="Times New Roman" w:cs="Times New Roman"/>
+        </w:rPr>
+        <w:t>Modelagem conceitual – 1º Fase</w:t>
+      </w:r>
+    </w:p>
+    <w:p>
+      <w:pPr>
+        <w:pStyle w:val="PargrafodaLista"/>
+        <w:numPr>
+          <w:ilvl w:val="1"/>
+          <w:numId w:val="4"/>
+        </w:numPr>
+        <w:rPr>
+          <w:rFonts w:ascii="Times New Roman" w:hAnsi="Times New Roman" w:cs="Times New Roman"/>
+        </w:rPr>
+      </w:pPr>
+      <w:r>
+        <w:rPr>
+          <w:rFonts w:ascii="Times New Roman" w:hAnsi="Times New Roman" w:cs="Times New Roman"/>
+        </w:rPr>
+        <w:t>Definição do diagrama com os requisitos coletados no DER</w:t>
+      </w:r>
+    </w:p>
+    <w:p>
+      <w:pPr>
+        <w:pStyle w:val="PargrafodaLista"/>
+        <w:numPr>
+          <w:ilvl w:val="2"/>
+          <w:numId w:val="4"/>
+        </w:numPr>
+        <w:rPr>
+          <w:rFonts w:ascii="Times New Roman" w:hAnsi="Times New Roman" w:cs="Times New Roman"/>
+        </w:rPr>
+      </w:pPr>
+      <w:r>
+        <w:rPr>
+          <w:rFonts w:ascii="Times New Roman" w:hAnsi="Times New Roman" w:cs="Times New Roman"/>
+        </w:rPr>
+        <w:t>Atributos</w:t>
+      </w:r>
+    </w:p>
+    <w:p>
+      <w:pPr>
+        <w:pStyle w:val="PargrafodaLista"/>
+        <w:numPr>
+          <w:ilvl w:val="2"/>
+          <w:numId w:val="4"/>
+        </w:numPr>
+        <w:rPr>
+          <w:rFonts w:ascii="Times New Roman" w:hAnsi="Times New Roman" w:cs="Times New Roman"/>
+        </w:rPr>
+      </w:pPr>
+      <w:r>
+        <w:rPr>
+          <w:rFonts w:ascii="Times New Roman" w:hAnsi="Times New Roman" w:cs="Times New Roman"/>
+        </w:rPr>
+        <w:t xml:space="preserve">Entidades (tabelas) </w:t>
+      </w:r>
+      <w:r>
+        <w:rPr>
+          <w:rFonts w:ascii="Times New Roman" w:hAnsi="Times New Roman" w:cs="Times New Roman"/>
+        </w:rPr>
+        <w:sym w:font="Wingdings" w:char="F0E0"/>
+      </w:r>
+      <w:r>
+        <w:rPr>
+          <w:rFonts w:ascii="Times New Roman" w:hAnsi="Times New Roman" w:cs="Times New Roman"/>
+        </w:rPr>
+        <w:t xml:space="preserve"> colocar no mesmo lugar os </w:t>
+      </w:r>
+      <w:r>
+        <w:rPr>
+          <w:rFonts w:ascii="Times New Roman" w:hAnsi="Times New Roman" w:cs="Times New Roman"/>
+        </w:rPr>
+        <w:t>diferentes seres com características semelhantes</w:t>
+      </w:r>
+    </w:p>
+    <w:p>
+      <w:pPr>
+        <w:pStyle w:val="PargrafodaLista"/>
+        <w:numPr>
+          <w:ilvl w:val="2"/>
+          <w:numId w:val="4"/>
+        </w:numPr>
+        <w:rPr>
+          <w:rFonts w:ascii="Times New Roman" w:hAnsi="Times New Roman" w:cs="Times New Roman"/>
+        </w:rPr>
+      </w:pPr>
+      <w:r>
+        <w:rPr>
+          <w:rFonts w:ascii="Times New Roman" w:hAnsi="Times New Roman" w:cs="Times New Roman"/>
+        </w:rPr>
+        <w:t>Relacionamento (cardinalidades)</w:t>
+      </w:r>
+    </w:p>
+    <w:p>
+      <w:pPr>
+        <w:pStyle w:val="PargrafodaLista"/>
+        <w:numPr>
+          <w:ilvl w:val="1"/>
+          <w:numId w:val="4"/>
+        </w:numPr>
+        <w:rPr>
+          <w:rFonts w:ascii="Times New Roman" w:hAnsi="Times New Roman" w:cs="Times New Roman"/>
+        </w:rPr>
+      </w:pPr>
+      <w:r>
+        <w:rPr>
+          <w:rFonts w:ascii="Times New Roman" w:hAnsi="Times New Roman" w:cs="Times New Roman"/>
+        </w:rPr>
+        <w:t>Ferramentas usadas na modelagem</w:t>
+      </w:r>
+    </w:p>
+    <w:p>
+      <w:pPr>
+        <w:pStyle w:val="PargrafodaLista"/>
+        <w:numPr>
+          <w:ilvl w:val="2"/>
+          <w:numId w:val="4"/>
+        </w:numPr>
+        <w:rPr>
+          <w:rFonts w:ascii="Times New Roman" w:hAnsi="Times New Roman" w:cs="Times New Roman"/>
+        </w:rPr>
+      </w:pPr>
+      <w:r>
+        <w:rPr>
+          <w:rFonts w:ascii="Times New Roman" w:hAnsi="Times New Roman" w:cs="Times New Roman"/>
+        </w:rPr>
+        <w:t>BrModelo</w:t>
+      </w:r>
+    </w:p>
+    <w:p>
+      <w:pPr>
+        <w:pStyle w:val="PargrafodaLista"/>
+        <w:numPr>
+          <w:ilvl w:val="2"/>
+          <w:numId w:val="4"/>
+        </w:numPr>
+        <w:rPr>
+          <w:rFonts w:ascii="Times New Roman" w:hAnsi="Times New Roman" w:cs="Times New Roman"/>
+        </w:rPr>
+      </w:pPr>
+      <w:r>
+        <w:rPr>
+          <w:rFonts w:ascii="Times New Roman" w:hAnsi="Times New Roman" w:cs="Times New Roman"/>
+        </w:rPr>
+        <w:t>BrModelo Online</w:t>
+      </w:r>
+    </w:p>
+    <w:p>
+      <w:pPr>
+        <w:pStyle w:val="PargrafodaLista"/>
+        <w:numPr>
+          <w:ilvl w:val="2"/>
+          <w:numId w:val="4"/>
+        </w:numPr>
+        <w:rPr>
+          <w:rFonts w:ascii="Times New Roman" w:hAnsi="Times New Roman" w:cs="Times New Roman"/>
+        </w:rPr>
+      </w:pPr>
+      <w:r>
+        <w:rPr>
+          <w:rFonts w:ascii="Times New Roman" w:hAnsi="Times New Roman" w:cs="Times New Roman"/>
+        </w:rPr>
+        <w:t>Workbench</w:t>
+      </w:r>
+    </w:p>
+    <w:p>
+      <w:pPr>
+        <w:pStyle w:val="PargrafodaLista"/>
+        <w:numPr>
+          <w:ilvl w:val="2"/>
+          <w:numId w:val="4"/>
+        </w:numPr>
+        <w:rPr>
+          <w:rFonts w:ascii="Times New Roman" w:hAnsi="Times New Roman" w:cs="Times New Roman"/>
+        </w:rPr>
+      </w:pPr>
+      <w:r>
+        <w:rPr>
+          <w:rFonts w:ascii="Times New Roman" w:hAnsi="Times New Roman" w:cs="Times New Roman"/>
+        </w:rPr>
+        <w:t>Lucidchart</w:t>
+      </w:r>
+    </w:p>
+    <w:p>
+      <w:pPr>
+        <w:pStyle w:val="PargrafodaLista"/>
+        <w:numPr>
+          <w:ilvl w:val="2"/>
+          <w:numId w:val="4"/>
+        </w:numPr>
+        <w:rPr>
+          <w:rFonts w:ascii="Times New Roman" w:hAnsi="Times New Roman" w:cs="Times New Roman"/>
+        </w:rPr>
+      </w:pPr>
+      <w:r>
+        <w:rPr>
+          <w:rFonts w:ascii="Times New Roman" w:hAnsi="Times New Roman" w:cs="Times New Roman"/>
+        </w:rPr>
+        <w:t>Draw.io</w:t>
+      </w:r>
+    </w:p>
+    <w:p>
+      <w:pPr>
+        <w:pStyle w:val="PargrafodaLista"/>
+        <w:numPr>
+          <w:ilvl w:val="1"/>
+          <w:numId w:val="4"/>
+        </w:numPr>
+        <w:rPr>
+          <w:rFonts w:ascii="Times New Roman" w:hAnsi="Times New Roman" w:cs="Times New Roman"/>
+        </w:rPr>
+      </w:pPr>
+      <w:r>
+        <w:rPr>
+          <w:rFonts w:ascii="Times New Roman" w:hAnsi="Times New Roman" w:cs="Times New Roman"/>
+        </w:rPr>
+        <w:t>O que cada forma representa</w:t>
+      </w:r>
+    </w:p>
+    <w:p>
+      <w:pPr>
+        <w:pStyle w:val="PargrafodaLista"/>
+        <w:numPr>
+          <w:ilvl w:val="2"/>
+          <w:numId w:val="4"/>
+        </w:numPr>
+        <w:rPr>
+          <w:rFonts w:ascii="Times New Roman" w:hAnsi="Times New Roman" w:cs="Times New Roman"/>
+        </w:rPr>
+      </w:pPr>
+      <w:r>
+        <w:rPr>
+          <w:rFonts w:ascii="Times New Roman" w:hAnsi="Times New Roman" w:cs="Times New Roman"/>
+        </w:rPr>
+        <w:t>Retângulo: entidades</w:t>
+      </w:r>
+    </w:p>
+    <w:p>
+      <w:pPr>
+        <w:pStyle w:val="PargrafodaLista"/>
+        <w:numPr>
+          <w:ilvl w:val="2"/>
+          <w:numId w:val="4"/>
+        </w:numPr>
+        <w:rPr>
+          <w:rFonts w:ascii="Times New Roman" w:hAnsi="Times New Roman" w:cs="Times New Roman"/>
+        </w:rPr>
+      </w:pPr>
+      <w:r>
+        <w:rPr>
+          <w:rFonts w:ascii="Times New Roman" w:hAnsi="Times New Roman" w:cs="Times New Roman"/>
+        </w:rPr>
+        <w:t>Elipse: atributos</w:t>
+      </w:r>
+    </w:p>
+    <w:p>
+      <w:pPr>
+        <w:pStyle w:val="PargrafodaLista"/>
+        <w:numPr>
+          <w:ilvl w:val="2"/>
+          <w:numId w:val="4"/>
+        </w:numPr>
+        <w:rPr>
+          <w:rFonts w:ascii="Times New Roman" w:hAnsi="Times New Roman" w:cs="Times New Roman"/>
+        </w:rPr>
+      </w:pPr>
+      <w:r>
+        <w:rPr>
+          <w:rFonts w:ascii="Times New Roman" w:hAnsi="Times New Roman" w:cs="Times New Roman"/>
+        </w:rPr>
+        <w:lastRenderedPageBreak/>
+        <w:t>Linhas/setas: relacionamentos</w:t>
+      </w:r>
+    </w:p>
+    <w:p>
+      <w:pPr>
+        <w:pStyle w:val="PargrafodaLista"/>
+        <w:ind w:left="2868"/>
+        <w:rPr>
+          <w:rFonts w:ascii="Times New Roman" w:hAnsi="Times New Roman" w:cs="Times New Roman"/>
+        </w:rPr>
+      </w:pPr>
+    </w:p>
+    <w:p>
+      <w:pPr>
+        <w:pStyle w:val="PargrafodaLista"/>
+        <w:numPr>
+          <w:ilvl w:val="0"/>
+          <w:numId w:val="4"/>
+        </w:numPr>
+        <w:rPr>
+          <w:rFonts w:ascii="Times New Roman" w:hAnsi="Times New Roman" w:cs="Times New Roman"/>
+        </w:rPr>
+      </w:pPr>
+      <w:r>
+        <w:rPr>
+          <w:rFonts w:ascii="Times New Roman" w:hAnsi="Times New Roman" w:cs="Times New Roman"/>
+        </w:rPr>
+        <w:t>Modelagem lógica – 2º Fase</w:t>
+      </w:r>
+    </w:p>
+    <w:p>
+      <w:pPr>
+        <w:pStyle w:val="PargrafodaLista"/>
+        <w:numPr>
+          <w:ilvl w:val="0"/>
+          <w:numId w:val="4"/>
+        </w:numPr>
+        <w:rPr>
+          <w:rFonts w:ascii="Times New Roman" w:hAnsi="Times New Roman" w:cs="Times New Roman"/>
+        </w:rPr>
+      </w:pPr>
+      <w:r>
+        <w:rPr>
+          <w:rFonts w:ascii="Times New Roman" w:hAnsi="Times New Roman" w:cs="Times New Roman"/>
+        </w:rPr>
+        <w:t>Modelagem Física – 3º Fase</w:t>
+      </w:r>
+    </w:p>
+    <w:p>
+      <w:pPr>
+        <w:pStyle w:val="PargrafodaLista"/>
+        <w:numPr>
+          <w:ilvl w:val="1"/>
+          <w:numId w:val="4"/>
+        </w:numPr>
+        <w:rPr>
+          <w:rFonts w:ascii="Times New Roman" w:hAnsi="Times New Roman" w:cs="Times New Roman"/>
+        </w:rPr>
+      </w:pPr>
+      <w:r>
+        <w:rPr>
+          <w:rFonts w:ascii="Times New Roman" w:hAnsi="Times New Roman" w:cs="Times New Roman"/>
+        </w:rPr>
+        <w:t>Criação do Banco de Dados</w:t>
+      </w:r>
+    </w:p>
+    <w:p>
+      <w:pPr>
+        <w:rPr>
+          <w:rFonts w:ascii="Times New Roman" w:hAnsi="Times New Roman" w:cs="Times New Roman"/>
+        </w:rPr>
+      </w:pPr>
+    </w:p>
+    <w:p>
+      <w:pPr>
+        <w:rPr>
+          <w:rFonts w:ascii="Times New Roman" w:hAnsi="Times New Roman" w:cs="Times New Roman"/>
+        </w:rPr>
+      </w:pPr>
+      <w:r>
+        <w:rPr>
+          <w:rFonts w:ascii="Times New Roman" w:hAnsi="Times New Roman" w:cs="Times New Roman"/>
+        </w:rPr>
+        <w:t>*Obs.: Entidade é o mesmo que tabela</w:t>
+      </w:r>
+    </w:p>
+    <w:p>
+      <w:pPr>
+        <w:rPr>
+          <w:rFonts w:ascii="Times New Roman" w:hAnsi="Times New Roman" w:cs="Times New Roman"/>
+        </w:rPr>
+      </w:pPr>
+    </w:p>
+    <w:p>
+      <w:pPr>
+        <w:rPr>
+          <w:rFonts w:ascii="Times New Roman" w:hAnsi="Times New Roman" w:cs="Times New Roman"/>
+        </w:rPr>
+      </w:pPr>
+      <w:r>
+        <w:rPr>
+          <w:rFonts w:ascii="Times New Roman" w:hAnsi="Times New Roman" w:cs="Times New Roman"/>
+        </w:rPr>
+        <w:t>Entidade</w:t>
+      </w:r>
+    </w:p>
+    <w:p>
+      <w:pPr>
+        <w:rPr>
+          <w:rFonts w:ascii="Times New Roman" w:hAnsi="Times New Roman" w:cs="Times New Roman"/>
+        </w:rPr>
+      </w:pPr>
+      <w:r>
+        <w:rPr>
+          <w:rFonts w:ascii="Times New Roman" w:hAnsi="Times New Roman" w:cs="Times New Roman"/>
+        </w:rPr>
+        <w:t>Algo importante para o usuário ou empresa que</w:t>
+      </w:r>
+      <w:bookmarkStart w:id="0" w:name="_GoBack"/>
+      <w:bookmarkEnd w:id="0"/>
+    </w:p>
+    <w:p>
+      <w:pPr>
+        <w:rPr>
+          <w:rFonts w:ascii="Times New Roman" w:hAnsi="Times New Roman" w:cs="Times New Roman"/>
+        </w:rPr>
+      </w:pPr>
+    </w:p>
+    <w:p>
+      <w:pPr>
         <w:rPr>
           <w:rFonts w:ascii="Times New Roman" w:hAnsi="Times New Roman" w:cs="Times New Roman"/>
           <w:b/>
           <w:sz w:val="24"/>
         </w:rPr>
-        <w:t>Funções de um SGBD</w:t>
-      </w:r>
-    </w:p>
-    <w:p>
-      <w:pPr>
-        <w:rPr>
-          <w:rFonts w:ascii="Times New Roman" w:hAnsi="Times New Roman" w:cs="Times New Roman"/>
-        </w:rPr>
-      </w:pPr>
-      <w:r>
-        <w:rPr>
-          <w:rFonts w:ascii="Times New Roman" w:hAnsi="Times New Roman" w:cs="Times New Roman"/>
-        </w:rPr>
-        <w:t>Inserir, excluir, acessar, visualizar</w:t>
-      </w:r>
-    </w:p>
-    <w:p>
-      <w:pPr>
-        <w:rPr>
-          <w:rFonts w:ascii="Times New Roman" w:hAnsi="Times New Roman" w:cs="Times New Roman"/>
-        </w:rPr>
-      </w:pPr>
-    </w:p>
-    <w:p>
-      <w:pPr>
-        <w:rPr>
-          <w:rFonts w:ascii="Times New Roman" w:hAnsi="Times New Roman" w:cs="Times New Roman"/>
-        </w:rPr>
-      </w:pPr>
-    </w:p>
-    <w:p>
-      <w:pPr>
-        <w:rPr>
-          <w:rFonts w:ascii="Times New Roman" w:hAnsi="Times New Roman" w:cs="Times New Roman"/>
-        </w:rPr>
-      </w:pPr>
-    </w:p>
-    <w:p>
-      <w:pPr>
-        <w:rPr>
-          <w:rFonts w:ascii="Times New Roman" w:hAnsi="Times New Roman" w:cs="Times New Roman"/>
-        </w:rPr>
-      </w:pPr>
-    </w:p>
-    <w:p>
-      <w:pPr>
-        <w:rPr>
-          <w:rFonts w:ascii="Times New Roman" w:hAnsi="Times New Roman" w:cs="Times New Roman"/>
-        </w:rPr>
-      </w:pPr>
-      <w:r>
-        <w:rPr>
-          <w:rFonts w:ascii="Times New Roman" w:hAnsi="Times New Roman" w:cs="Times New Roman"/>
-        </w:rPr>
-        <w:t>Modelos de Banco de Dados</w:t>
-      </w:r>
-    </w:p>
-    <w:p>
-      <w:pPr>
-        <w:rPr>
-          <w:rFonts w:ascii="Times New Roman" w:hAnsi="Times New Roman" w:cs="Times New Roman"/>
-        </w:rPr>
-      </w:pPr>
-      <w:r>
-        <w:rPr>
-          <w:rFonts w:ascii="Times New Roman" w:hAnsi="Times New Roman" w:cs="Times New Roman"/>
-        </w:rPr>
-        <w:t>Modelo Hierárquico</w:t>
-      </w:r>
-    </w:p>
-    <w:p>
-      <w:pPr>
-        <w:rPr>
-          <w:rFonts w:ascii="Times New Roman" w:hAnsi="Times New Roman" w:cs="Times New Roman"/>
-        </w:rPr>
-      </w:pPr>
-      <w:r>
-        <w:rPr>
-          <w:rFonts w:ascii="Times New Roman" w:hAnsi="Times New Roman" w:cs="Times New Roman"/>
-        </w:rPr>
-        <w:t>Neste model</w:t>
-      </w:r>
-      <w:r>
-        <w:rPr>
-          <w:rFonts w:ascii="Times New Roman" w:hAnsi="Times New Roman" w:cs="Times New Roman"/>
-        </w:rPr>
-        <w:t>o</w:t>
-      </w:r>
-      <w:r>
-        <w:rPr>
-          <w:rFonts w:ascii="Times New Roman" w:hAnsi="Times New Roman" w:cs="Times New Roman"/>
-        </w:rPr>
-        <w:t>, os dados são organizados de forma hierárquica</w:t>
-      </w:r>
-    </w:p>
-    <w:p>
-      <w:pPr>
-        <w:rPr>
-          <w:rFonts w:ascii="Times New Roman" w:hAnsi="Times New Roman" w:cs="Times New Roman"/>
-        </w:rPr>
-      </w:pPr>
-    </w:p>
-    <w:p>
-      <w:pPr>
-        <w:rPr>
-          <w:rFonts w:ascii="Times New Roman" w:hAnsi="Times New Roman" w:cs="Times New Roman"/>
-        </w:rPr>
-      </w:pPr>
-    </w:p>
-    <w:p>
-      <w:pPr>
-        <w:rPr>
-          <w:rFonts w:ascii="Times New Roman" w:hAnsi="Times New Roman" w:cs="Times New Roman"/>
-        </w:rPr>
-      </w:pPr>
-    </w:p>
-    <w:p>
-      <w:pPr>
-        <w:rPr>
-          <w:rFonts w:ascii="Times New Roman" w:hAnsi="Times New Roman" w:cs="Times New Roman"/>
-        </w:rPr>
-      </w:pPr>
-      <w:r>
-        <w:rPr>
-          <w:rFonts w:ascii="Times New Roman" w:hAnsi="Times New Roman" w:cs="Times New Roman"/>
-        </w:rPr>
-        <w:t>Modelagem de Dados (Modelo Relaciona)</w:t>
-      </w:r>
-    </w:p>
-    <w:p>
-      <w:pPr>
-        <w:rPr>
-          <w:rFonts w:ascii="Times New Roman" w:hAnsi="Times New Roman" w:cs="Times New Roman"/>
-        </w:rPr>
-      </w:pPr>
-      <w:r>
-        <w:rPr>
-          <w:rFonts w:ascii="Times New Roman" w:hAnsi="Times New Roman" w:cs="Times New Roman"/>
-        </w:rPr>
-        <w:t>DER: Diagrama Entidade Relacionamento</w:t>
-      </w:r>
-    </w:p>
-    <w:p>
-      <w:pPr>
-        <w:rPr>
-          <w:rFonts w:ascii="Times New Roman" w:hAnsi="Times New Roman" w:cs="Times New Roman"/>
-        </w:rPr>
-      </w:pPr>
-      <w:r>
-        <w:rPr>
-          <w:rFonts w:ascii="Times New Roman" w:hAnsi="Times New Roman" w:cs="Times New Roman"/>
-        </w:rPr>
-        <w:t>MER: Modelo Entidade Relacional (gráficos)</w:t>
-      </w:r>
+      </w:pPr>
+      <w:r>
+        <w:rPr>
+          <w:rFonts w:ascii="Times New Roman" w:hAnsi="Times New Roman" w:cs="Times New Roman"/>
+          <w:b/>
+          <w:sz w:val="24"/>
+        </w:rPr>
+        <w:t>Modelagem de dados</w:t>
+      </w:r>
+    </w:p>
+    <w:p>
+      <w:pPr>
+        <w:pStyle w:val="PargrafodaLista"/>
+        <w:numPr>
+          <w:ilvl w:val="0"/>
+          <w:numId w:val="5"/>
+        </w:numPr>
+        <w:rPr>
+          <w:rFonts w:ascii="Times New Roman" w:hAnsi="Times New Roman" w:cs="Times New Roman"/>
+        </w:rPr>
+      </w:pPr>
+      <w:r>
+        <w:rPr>
+          <w:rFonts w:ascii="Times New Roman" w:hAnsi="Times New Roman" w:cs="Times New Roman"/>
+        </w:rPr>
+        <w:t>É o processo de criação de um modelo de dados para um sistema de informação com aplicações técnicas especificas</w:t>
+      </w:r>
+    </w:p>
+    <w:p>
+      <w:pPr>
+        <w:pStyle w:val="PargrafodaLista"/>
+        <w:numPr>
+          <w:ilvl w:val="0"/>
+          <w:numId w:val="5"/>
+        </w:numPr>
+        <w:rPr>
+          <w:rFonts w:ascii="Times New Roman" w:hAnsi="Times New Roman" w:cs="Times New Roman"/>
+        </w:rPr>
+      </w:pPr>
+      <w:r>
+        <w:rPr>
+          <w:rFonts w:ascii="Times New Roman" w:hAnsi="Times New Roman" w:cs="Times New Roman"/>
+        </w:rPr>
+        <w:t>Processo de definir e analisar os requisitos de dados necessários para reproduzir de forma informatizada um contexto do mundo real</w:t>
+      </w:r>
+    </w:p>
+    <w:p>
+      <w:pPr>
+        <w:pStyle w:val="PargrafodaLista"/>
+        <w:numPr>
+          <w:ilvl w:val="0"/>
+          <w:numId w:val="5"/>
+        </w:numPr>
+        <w:rPr>
+          <w:rFonts w:ascii="Times New Roman" w:hAnsi="Times New Roman" w:cs="Times New Roman"/>
+        </w:rPr>
+      </w:pPr>
+      <w:r>
+        <w:rPr>
+          <w:rFonts w:ascii="Times New Roman" w:hAnsi="Times New Roman" w:cs="Times New Roman"/>
+        </w:rPr>
+        <w:t>Um modelo de dados sempre force uma estrutura para os dados usados em um SI</w:t>
+      </w:r>
+    </w:p>
+    <w:p>
+      <w:pPr>
+        <w:rPr>
+          <w:rFonts w:ascii="Times New Roman" w:hAnsi="Times New Roman" w:cs="Times New Roman"/>
+        </w:rPr>
+      </w:pPr>
+    </w:p>
+    <w:p>
+      <w:pPr>
+        <w:ind w:left="360"/>
+        <w:rPr>
+          <w:rFonts w:ascii="Times New Roman" w:hAnsi="Times New Roman" w:cs="Times New Roman"/>
+          <w:b/>
+        </w:rPr>
+      </w:pPr>
+      <w:r>
+        <w:rPr>
+          <w:rFonts w:ascii="Times New Roman" w:hAnsi="Times New Roman" w:cs="Times New Roman"/>
+          <w:b/>
+        </w:rPr>
+        <w:t>Modelo Relacional</w:t>
+      </w:r>
+    </w:p>
+    <w:p>
+      <w:pPr>
+        <w:rPr>
+          <w:rFonts w:ascii="Times New Roman" w:hAnsi="Times New Roman" w:cs="Times New Roman"/>
+        </w:rPr>
+      </w:pPr>
+      <w:r>
+        <w:rPr>
+          <w:rFonts w:ascii="Times New Roman" w:hAnsi="Times New Roman" w:cs="Times New Roman"/>
+        </w:rPr>
+        <w:t xml:space="preserve">Os princípios do modelo relacional foram esboçados por Edgar Frank </w:t>
+      </w:r>
+      <w:proofErr w:type="spellStart"/>
+      <w:r>
+        <w:rPr>
+          <w:rFonts w:ascii="Times New Roman" w:hAnsi="Times New Roman" w:cs="Times New Roman"/>
+        </w:rPr>
+        <w:t>Codd</w:t>
+      </w:r>
+      <w:proofErr w:type="spellEnd"/>
+      <w:r>
+        <w:rPr>
+          <w:rFonts w:ascii="Times New Roman" w:hAnsi="Times New Roman" w:cs="Times New Roman"/>
+        </w:rPr>
+        <w:t xml:space="preserve"> (IBM) em 1970, publicado em um artigo de nome “A </w:t>
+      </w:r>
+      <w:proofErr w:type="spellStart"/>
+      <w:r>
+        <w:rPr>
+          <w:rFonts w:ascii="Times New Roman" w:hAnsi="Times New Roman" w:cs="Times New Roman"/>
+        </w:rPr>
+        <w:t>Relational</w:t>
+      </w:r>
+      <w:proofErr w:type="spellEnd"/>
+      <w:r>
+        <w:rPr>
+          <w:rFonts w:ascii="Times New Roman" w:hAnsi="Times New Roman" w:cs="Times New Roman"/>
+        </w:rPr>
+        <w:t xml:space="preserve"> Modelo f Data for </w:t>
+      </w:r>
+      <w:proofErr w:type="spellStart"/>
+      <w:r>
+        <w:rPr>
+          <w:rFonts w:ascii="Times New Roman" w:hAnsi="Times New Roman" w:cs="Times New Roman"/>
+        </w:rPr>
+        <w:t>Large</w:t>
+      </w:r>
+      <w:proofErr w:type="spellEnd"/>
       <w:r>
         <w:rPr>
           <w:rFonts w:ascii="Times New Roman" w:hAnsi="Times New Roman" w:cs="Times New Roman"/>
         </w:rPr>
         <w:t xml:space="preserve"> </w:t>
       </w:r>
-    </w:p>
-    <w:p>
-      <w:pPr>
-        <w:rPr>
-          <w:rFonts w:ascii="Times New Roman" w:hAnsi="Times New Roman" w:cs="Times New Roman"/>
-        </w:rPr>
-      </w:pPr>
-    </w:p>
-    <w:p>
-      <w:pPr>
-        <w:rPr>
-          <w:rFonts w:ascii="Times New Roman" w:hAnsi="Times New Roman" w:cs="Times New Roman"/>
-          <w:b/>
-        </w:rPr>
-      </w:pPr>
-      <w:r>
-        <w:rPr>
-          <w:rFonts w:ascii="Times New Roman" w:hAnsi="Times New Roman" w:cs="Times New Roman"/>
-          <w:b/>
-        </w:rPr>
-        <w:t>Entidade</w:t>
-      </w:r>
-      <w:r>
-        <w:rPr>
-          <w:rFonts w:ascii="Times New Roman" w:hAnsi="Times New Roman" w:cs="Times New Roman"/>
-          <w:b/>
-        </w:rPr>
-        <w:t xml:space="preserve"> e relacionamento (entre tabelas)</w:t>
-      </w:r>
-    </w:p>
-    <w:p>
-      <w:pPr>
-        <w:ind w:left="708"/>
-        <w:rPr>
-          <w:rFonts w:ascii="Times New Roman" w:hAnsi="Times New Roman" w:cs="Times New Roman"/>
-        </w:rPr>
-      </w:pPr>
-      <w:r>
-        <w:rPr>
-          <w:rFonts w:ascii="Times New Roman" w:hAnsi="Times New Roman" w:cs="Times New Roman"/>
-        </w:rPr>
-        <w:t>Fases de Desenvolvimento:</w:t>
+      <w:proofErr w:type="spellStart"/>
+      <w:r>
+        <w:rPr>
+          <w:rFonts w:ascii="Times New Roman" w:hAnsi="Times New Roman" w:cs="Times New Roman"/>
+        </w:rPr>
+        <w:t>Shared</w:t>
+      </w:r>
+      <w:proofErr w:type="spellEnd"/>
+      <w:r>
+        <w:rPr>
+          <w:rFonts w:ascii="Times New Roman" w:hAnsi="Times New Roman" w:cs="Times New Roman"/>
+        </w:rPr>
+        <w:t xml:space="preserve"> Data Banks”</w:t>
       </w:r>
     </w:p>
     <w:p>
@@ -812,317 +1380,35 @@
         <w:pStyle w:val="PargrafodaLista"/>
         <w:numPr>
           <w:ilvl w:val="0"/>
-          <w:numId w:val="4"/>
-        </w:numPr>
-        <w:rPr>
-          <w:rFonts w:ascii="Times New Roman" w:hAnsi="Times New Roman" w:cs="Times New Roman"/>
-        </w:rPr>
-      </w:pPr>
-      <w:r>
-        <w:rPr>
-          <w:rFonts w:ascii="Times New Roman" w:hAnsi="Times New Roman" w:cs="Times New Roman"/>
-        </w:rPr>
-        <w:t>Modelagem conceitual – 1º Fase</w:t>
-      </w:r>
-    </w:p>
-    <w:p>
-      <w:pPr>
-        <w:pStyle w:val="PargrafodaLista"/>
-        <w:numPr>
-          <w:ilvl w:val="1"/>
-          <w:numId w:val="4"/>
-        </w:numPr>
-        <w:rPr>
-          <w:rFonts w:ascii="Times New Roman" w:hAnsi="Times New Roman" w:cs="Times New Roman"/>
-        </w:rPr>
-      </w:pPr>
-      <w:r>
-        <w:rPr>
-          <w:rFonts w:ascii="Times New Roman" w:hAnsi="Times New Roman" w:cs="Times New Roman"/>
-        </w:rPr>
-        <w:t>Definição do diagrama com os requisitos coletados no DER</w:t>
-      </w:r>
-    </w:p>
-    <w:p>
-      <w:pPr>
-        <w:pStyle w:val="PargrafodaLista"/>
-        <w:numPr>
-          <w:ilvl w:val="2"/>
-          <w:numId w:val="4"/>
-        </w:numPr>
-        <w:rPr>
-          <w:rFonts w:ascii="Times New Roman" w:hAnsi="Times New Roman" w:cs="Times New Roman"/>
-        </w:rPr>
-      </w:pPr>
-      <w:r>
-        <w:rPr>
-          <w:rFonts w:ascii="Times New Roman" w:hAnsi="Times New Roman" w:cs="Times New Roman"/>
-        </w:rPr>
-        <w:t>Atributos</w:t>
-      </w:r>
-    </w:p>
-    <w:p>
-      <w:pPr>
-        <w:pStyle w:val="PargrafodaLista"/>
-        <w:numPr>
-          <w:ilvl w:val="2"/>
-          <w:numId w:val="4"/>
-        </w:numPr>
-        <w:rPr>
-          <w:rFonts w:ascii="Times New Roman" w:hAnsi="Times New Roman" w:cs="Times New Roman"/>
-        </w:rPr>
-      </w:pPr>
-      <w:r>
-        <w:rPr>
-          <w:rFonts w:ascii="Times New Roman" w:hAnsi="Times New Roman" w:cs="Times New Roman"/>
-        </w:rPr>
-        <w:t xml:space="preserve">Entidades (tabelas) </w:t>
-      </w:r>
-      <w:r>
-        <w:rPr>
-          <w:rFonts w:ascii="Times New Roman" w:hAnsi="Times New Roman" w:cs="Times New Roman"/>
-        </w:rPr>
-        <w:sym w:font="Wingdings" w:char="F0E0"/>
-      </w:r>
-      <w:r>
-        <w:rPr>
-          <w:rFonts w:ascii="Times New Roman" w:hAnsi="Times New Roman" w:cs="Times New Roman"/>
-        </w:rPr>
-        <w:t xml:space="preserve"> colocar no mesmo lugar os </w:t>
-      </w:r>
-      <w:r>
-        <w:rPr>
-          <w:rFonts w:ascii="Times New Roman" w:hAnsi="Times New Roman" w:cs="Times New Roman"/>
-        </w:rPr>
-        <w:t>diferentes seres com características semelhantes</w:t>
-      </w:r>
-      <w:bookmarkStart w:id="0" w:name="_GoBack"/>
-      <w:bookmarkEnd w:id="0"/>
-    </w:p>
-    <w:p>
-      <w:pPr>
-        <w:pStyle w:val="PargrafodaLista"/>
-        <w:numPr>
-          <w:ilvl w:val="2"/>
-          <w:numId w:val="4"/>
-        </w:numPr>
-        <w:rPr>
-          <w:rFonts w:ascii="Times New Roman" w:hAnsi="Times New Roman" w:cs="Times New Roman"/>
-        </w:rPr>
-      </w:pPr>
-      <w:r>
-        <w:rPr>
-          <w:rFonts w:ascii="Times New Roman" w:hAnsi="Times New Roman" w:cs="Times New Roman"/>
-        </w:rPr>
-        <w:t>Relacionamento (cardinalidades)</w:t>
-      </w:r>
-    </w:p>
-    <w:p>
-      <w:pPr>
-        <w:pStyle w:val="PargrafodaLista"/>
-        <w:numPr>
-          <w:ilvl w:val="1"/>
-          <w:numId w:val="4"/>
-        </w:numPr>
-        <w:rPr>
-          <w:rFonts w:ascii="Times New Roman" w:hAnsi="Times New Roman" w:cs="Times New Roman"/>
-        </w:rPr>
-      </w:pPr>
-      <w:r>
-        <w:rPr>
-          <w:rFonts w:ascii="Times New Roman" w:hAnsi="Times New Roman" w:cs="Times New Roman"/>
-        </w:rPr>
-        <w:t>Ferramentas usadas na modelagem</w:t>
-      </w:r>
-    </w:p>
-    <w:p>
-      <w:pPr>
-        <w:pStyle w:val="PargrafodaLista"/>
-        <w:numPr>
-          <w:ilvl w:val="2"/>
-          <w:numId w:val="4"/>
-        </w:numPr>
-        <w:rPr>
-          <w:rFonts w:ascii="Times New Roman" w:hAnsi="Times New Roman" w:cs="Times New Roman"/>
-        </w:rPr>
-      </w:pPr>
-      <w:r>
-        <w:rPr>
-          <w:rFonts w:ascii="Times New Roman" w:hAnsi="Times New Roman" w:cs="Times New Roman"/>
-        </w:rPr>
-        <w:t>BrModelo</w:t>
-      </w:r>
-    </w:p>
-    <w:p>
-      <w:pPr>
-        <w:pStyle w:val="PargrafodaLista"/>
-        <w:numPr>
-          <w:ilvl w:val="2"/>
-          <w:numId w:val="4"/>
-        </w:numPr>
-        <w:rPr>
-          <w:rFonts w:ascii="Times New Roman" w:hAnsi="Times New Roman" w:cs="Times New Roman"/>
-        </w:rPr>
-      </w:pPr>
-      <w:r>
-        <w:rPr>
-          <w:rFonts w:ascii="Times New Roman" w:hAnsi="Times New Roman" w:cs="Times New Roman"/>
-        </w:rPr>
-        <w:t>BrModelo Online</w:t>
-      </w:r>
-    </w:p>
-    <w:p>
-      <w:pPr>
-        <w:pStyle w:val="PargrafodaLista"/>
-        <w:numPr>
-          <w:ilvl w:val="2"/>
-          <w:numId w:val="4"/>
-        </w:numPr>
-        <w:rPr>
-          <w:rFonts w:ascii="Times New Roman" w:hAnsi="Times New Roman" w:cs="Times New Roman"/>
-        </w:rPr>
-      </w:pPr>
-      <w:r>
-        <w:rPr>
-          <w:rFonts w:ascii="Times New Roman" w:hAnsi="Times New Roman" w:cs="Times New Roman"/>
-        </w:rPr>
-        <w:t>Workbench</w:t>
-      </w:r>
-    </w:p>
-    <w:p>
-      <w:pPr>
-        <w:pStyle w:val="PargrafodaLista"/>
-        <w:numPr>
-          <w:ilvl w:val="2"/>
-          <w:numId w:val="4"/>
-        </w:numPr>
-        <w:rPr>
-          <w:rFonts w:ascii="Times New Roman" w:hAnsi="Times New Roman" w:cs="Times New Roman"/>
-        </w:rPr>
-      </w:pPr>
-      <w:r>
-        <w:rPr>
-          <w:rFonts w:ascii="Times New Roman" w:hAnsi="Times New Roman" w:cs="Times New Roman"/>
-        </w:rPr>
-        <w:t>Lucidchart</w:t>
-      </w:r>
-    </w:p>
-    <w:p>
-      <w:pPr>
-        <w:pStyle w:val="PargrafodaLista"/>
-        <w:numPr>
-          <w:ilvl w:val="2"/>
-          <w:numId w:val="4"/>
-        </w:numPr>
-        <w:rPr>
-          <w:rFonts w:ascii="Times New Roman" w:hAnsi="Times New Roman" w:cs="Times New Roman"/>
-        </w:rPr>
-      </w:pPr>
-      <w:r>
-        <w:rPr>
-          <w:rFonts w:ascii="Times New Roman" w:hAnsi="Times New Roman" w:cs="Times New Roman"/>
-        </w:rPr>
-        <w:t>Draw.io</w:t>
-      </w:r>
-    </w:p>
-    <w:p>
-      <w:pPr>
-        <w:pStyle w:val="PargrafodaLista"/>
-        <w:numPr>
-          <w:ilvl w:val="1"/>
-          <w:numId w:val="4"/>
-        </w:numPr>
-        <w:rPr>
-          <w:rFonts w:ascii="Times New Roman" w:hAnsi="Times New Roman" w:cs="Times New Roman"/>
-        </w:rPr>
-      </w:pPr>
-      <w:r>
-        <w:rPr>
-          <w:rFonts w:ascii="Times New Roman" w:hAnsi="Times New Roman" w:cs="Times New Roman"/>
-        </w:rPr>
-        <w:t>O que cada forma representa</w:t>
-      </w:r>
-    </w:p>
-    <w:p>
-      <w:pPr>
-        <w:pStyle w:val="PargrafodaLista"/>
-        <w:numPr>
-          <w:ilvl w:val="2"/>
-          <w:numId w:val="4"/>
-        </w:numPr>
-        <w:rPr>
-          <w:rFonts w:ascii="Times New Roman" w:hAnsi="Times New Roman" w:cs="Times New Roman"/>
-        </w:rPr>
-      </w:pPr>
-      <w:r>
-        <w:rPr>
-          <w:rFonts w:ascii="Times New Roman" w:hAnsi="Times New Roman" w:cs="Times New Roman"/>
-        </w:rPr>
-        <w:t>Retângulo: entidades</w:t>
-      </w:r>
-    </w:p>
-    <w:p>
-      <w:pPr>
-        <w:pStyle w:val="PargrafodaLista"/>
-        <w:numPr>
-          <w:ilvl w:val="2"/>
-          <w:numId w:val="4"/>
-        </w:numPr>
-        <w:rPr>
-          <w:rFonts w:ascii="Times New Roman" w:hAnsi="Times New Roman" w:cs="Times New Roman"/>
-        </w:rPr>
-      </w:pPr>
-      <w:r>
-        <w:rPr>
-          <w:rFonts w:ascii="Times New Roman" w:hAnsi="Times New Roman" w:cs="Times New Roman"/>
-        </w:rPr>
-        <w:t>Elipse: atributos</w:t>
-      </w:r>
-    </w:p>
-    <w:p>
-      <w:pPr>
-        <w:pStyle w:val="PargrafodaLista"/>
-        <w:numPr>
-          <w:ilvl w:val="2"/>
-          <w:numId w:val="4"/>
-        </w:numPr>
-        <w:rPr>
-          <w:rFonts w:ascii="Times New Roman" w:hAnsi="Times New Roman" w:cs="Times New Roman"/>
-        </w:rPr>
-      </w:pPr>
-      <w:r>
-        <w:rPr>
-          <w:rFonts w:ascii="Times New Roman" w:hAnsi="Times New Roman" w:cs="Times New Roman"/>
-        </w:rPr>
-        <w:lastRenderedPageBreak/>
-        <w:t>Linhas/setas: relacionamentos</w:t>
-      </w:r>
-    </w:p>
-    <w:p>
-      <w:pPr>
-        <w:pStyle w:val="PargrafodaLista"/>
-        <w:ind w:left="2868"/>
-        <w:rPr>
-          <w:rFonts w:ascii="Times New Roman" w:hAnsi="Times New Roman" w:cs="Times New Roman"/>
-        </w:rPr>
-      </w:pPr>
+          <w:numId w:val="6"/>
+        </w:numPr>
+        <w:rPr>
+          <w:rFonts w:ascii="Times New Roman" w:hAnsi="Times New Roman" w:cs="Times New Roman"/>
+        </w:rPr>
+      </w:pPr>
+      <w:r>
+        <w:rPr>
+          <w:rFonts w:ascii="Times New Roman" w:hAnsi="Times New Roman" w:cs="Times New Roman"/>
+        </w:rPr>
+        <w:t>Antes disso se utilizava modelos como hierárquico e o modelo em rede</w:t>
+      </w:r>
     </w:p>
     <w:p>
       <w:pPr>
         <w:pStyle w:val="PargrafodaLista"/>
         <w:numPr>
           <w:ilvl w:val="0"/>
-          <w:numId w:val="4"/>
-        </w:numPr>
-        <w:rPr>
-          <w:rFonts w:ascii="Times New Roman" w:hAnsi="Times New Roman" w:cs="Times New Roman"/>
-        </w:rPr>
-      </w:pPr>
-      <w:r>
-        <w:rPr>
-          <w:rFonts w:ascii="Times New Roman" w:hAnsi="Times New Roman" w:cs="Times New Roman"/>
-        </w:rPr>
-        <w:t>Modelagem lógica – 2º Fase</w:t>
+          <w:numId w:val="6"/>
+        </w:numPr>
+        <w:rPr>
+          <w:rFonts w:ascii="Times New Roman" w:hAnsi="Times New Roman" w:cs="Times New Roman"/>
+        </w:rPr>
+      </w:pPr>
+      <w:r>
+        <w:rPr>
+          <w:rFonts w:ascii="Times New Roman" w:hAnsi="Times New Roman" w:cs="Times New Roman"/>
+        </w:rPr>
+        <w:t>Nesse modelo os dados são organizados em tabelas bidimensionais</w:t>
       </w:r>
     </w:p>
     <w:p>
@@ -1130,55 +1416,85 @@
         <w:pStyle w:val="PargrafodaLista"/>
         <w:numPr>
           <w:ilvl w:val="0"/>
-          <w:numId w:val="4"/>
-        </w:numPr>
-        <w:rPr>
-          <w:rFonts w:ascii="Times New Roman" w:hAnsi="Times New Roman" w:cs="Times New Roman"/>
-        </w:rPr>
-      </w:pPr>
-      <w:r>
-        <w:rPr>
-          <w:rFonts w:ascii="Times New Roman" w:hAnsi="Times New Roman" w:cs="Times New Roman"/>
-        </w:rPr>
-        <w:t>Modelagem Física – 3º Fase</w:t>
-      </w:r>
-    </w:p>
-    <w:p>
-      <w:pPr>
-        <w:pStyle w:val="PargrafodaLista"/>
-        <w:numPr>
-          <w:ilvl w:val="1"/>
-          <w:numId w:val="4"/>
-        </w:numPr>
-        <w:rPr>
-          <w:rFonts w:ascii="Times New Roman" w:hAnsi="Times New Roman" w:cs="Times New Roman"/>
-        </w:rPr>
-      </w:pPr>
-      <w:r>
-        <w:rPr>
-          <w:rFonts w:ascii="Times New Roman" w:hAnsi="Times New Roman" w:cs="Times New Roman"/>
-        </w:rPr>
-        <w:t>Criação do Banco de Dados</w:t>
-      </w:r>
-    </w:p>
-    <w:p>
-      <w:pPr>
-        <w:rPr>
-          <w:rFonts w:ascii="Times New Roman" w:hAnsi="Times New Roman" w:cs="Times New Roman"/>
-        </w:rPr>
-      </w:pPr>
-    </w:p>
-    <w:p>
-      <w:pPr>
-        <w:rPr>
-          <w:rFonts w:ascii="Times New Roman" w:hAnsi="Times New Roman" w:cs="Times New Roman"/>
-        </w:rPr>
-      </w:pPr>
-      <w:r>
-        <w:rPr>
-          <w:rFonts w:ascii="Times New Roman" w:hAnsi="Times New Roman" w:cs="Times New Roman"/>
-        </w:rPr>
-        <w:t>*Obs.: Entidade é o mesmo que tabela</w:t>
+          <w:numId w:val="6"/>
+        </w:numPr>
+        <w:rPr>
+          <w:rFonts w:ascii="Times New Roman" w:hAnsi="Times New Roman" w:cs="Times New Roman"/>
+        </w:rPr>
+      </w:pPr>
+      <w:r>
+        <w:rPr>
+          <w:rFonts w:ascii="Times New Roman" w:hAnsi="Times New Roman" w:cs="Times New Roman"/>
+        </w:rPr>
+        <w:t>Essas tabelas também podem ser chamadas de relações</w:t>
+      </w:r>
+    </w:p>
+    <w:p>
+      <w:pPr>
+        <w:pStyle w:val="PargrafodaLista"/>
+        <w:numPr>
+          <w:ilvl w:val="0"/>
+          <w:numId w:val="6"/>
+        </w:numPr>
+        <w:rPr>
+          <w:rFonts w:ascii="Times New Roman" w:hAnsi="Times New Roman" w:cs="Times New Roman"/>
+        </w:rPr>
+      </w:pPr>
+      <w:r>
+        <w:rPr>
+          <w:rFonts w:ascii="Times New Roman" w:hAnsi="Times New Roman" w:cs="Times New Roman"/>
+        </w:rPr>
+        <w:t>Relação é uma forma de se organizar os dados em linhas e</w:t>
+      </w:r>
+      <w:r>
+        <w:rPr>
+          <w:rFonts w:ascii="Times New Roman" w:hAnsi="Times New Roman" w:cs="Times New Roman"/>
+        </w:rPr>
+        <w:t xml:space="preserve"> </w:t>
+      </w:r>
+      <w:r>
+        <w:rPr>
+          <w:rFonts w:ascii="Times New Roman" w:hAnsi="Times New Roman" w:cs="Times New Roman"/>
+        </w:rPr>
+        <w:t>colunas.</w:t>
+      </w:r>
+    </w:p>
+    <w:p>
+      <w:pPr>
+        <w:pStyle w:val="PargrafodaLista"/>
+        <w:numPr>
+          <w:ilvl w:val="0"/>
+          <w:numId w:val="6"/>
+        </w:numPr>
+        <w:rPr>
+          <w:rFonts w:ascii="Times New Roman" w:hAnsi="Times New Roman" w:cs="Times New Roman"/>
+        </w:rPr>
+      </w:pPr>
+      <w:r>
+        <w:rPr>
+          <w:rFonts w:ascii="Times New Roman" w:hAnsi="Times New Roman" w:cs="Times New Roman"/>
+        </w:rPr>
+        <w:t>Baseado em lógica e teoria de conjuntos</w:t>
+      </w:r>
+    </w:p>
+    <w:p>
+      <w:pPr>
+        <w:rPr>
+          <w:rFonts w:ascii="Times New Roman" w:hAnsi="Times New Roman" w:cs="Times New Roman"/>
+        </w:rPr>
+      </w:pPr>
+    </w:p>
+    <w:p>
+      <w:pPr>
+        <w:rPr>
+          <w:rFonts w:ascii="Times New Roman" w:hAnsi="Times New Roman" w:cs="Times New Roman"/>
+        </w:rPr>
+      </w:pPr>
+      <w:r>
+        <w:rPr>
+          <w:rFonts w:ascii="Times New Roman" w:hAnsi="Times New Roman" w:cs="Times New Roman"/>
+        </w:rPr>
+        <w:t>Coluna = Atributos: armazena e descreve uma característica de um ser</w:t>
       </w:r>
     </w:p>
     <w:sectPr>
@@ -1194,6 +1510,232 @@
 <file path=word/numbering.xml><?xml version="1.0" encoding="utf-8"?>
 <w:numbering xmlns:wpc="http://schemas.microsoft.com/office/word/2010/wordprocessingCanvas" xmlns:cx="http://schemas.microsoft.com/office/drawing/2014/chartex" xmlns:cx1="http://schemas.microsoft.com/office/drawing/2015/9/8/chartex" xmlns:cx2="http://schemas.microsoft.com/office/drawing/2015/10/21/chartex" xmlns:cx3="http://schemas.microsoft.com/office/drawing/2016/5/9/chartex" xmlns:cx4="http://schemas.microsoft.com/office/drawing/2016/5/10/chartex" xmlns:cx5="http://schemas.microsoft.com/office/drawing/2016/5/11/chartex" xmlns:cx6="http://schemas.microsoft.com/office/drawing/2016/5/12/chartex" xmlns:cx7="http://schemas.microsoft.com/office/drawing/2016/5/13/chartex" xmlns:cx8="http://schemas.microsoft.com/office/drawing/2016/5/14/chartex" xmlns:mc="http://schemas.openxmlformats.org/markup-compatibility/2006" xmlns:aink="http://schemas.microsoft.com/office/drawing/2016/ink" xmlns:am3d="http://schemas.microsoft.com/office/drawing/2017/model3d" xmlns:o="urn:schemas-microsoft-com:office:office" xmlns:r="http://schemas.openxmlformats.org/officeDocument/2006/relationships" xmlns:m="http://schemas.openxmlformats.org/officeDocument/2006/math" xmlns:v="urn:schemas-microsoft-com:vml" xmlns:wp14="http://schemas.microsoft.com/office/word/2010/wordprocessingDrawing" xmlns:wp="http://schemas.openxmlformats.org/drawingml/2006/wordprocessingDrawing" xmlns:w10="urn:schemas-microsoft-com:office:word" xmlns:w="http://schemas.openxmlformats.org/wordprocessingml/2006/main" xmlns:w14="http://schemas.microsoft.com/office/word/2010/wordml" xmlns:w15="http://schemas.microsoft.com/office/word/2012/wordml" xmlns:w16cid="http://schemas.microsoft.com/office/word/2016/wordml/cid" xmlns:w16se="http://schemas.microsoft.com/office/word/2015/wordml/symex" xmlns:wpg="http://schemas.microsoft.com/office/word/2010/wordprocessingGroup" xmlns:wpi="http://schemas.microsoft.com/office/word/2010/wordprocessingInk" xmlns:wne="http://schemas.microsoft.com/office/word/2006/wordml" xmlns:wps="http://schemas.microsoft.com/office/word/2010/wordprocessingShape" mc:Ignorable="w14 w15 w16se w16cid wp14">
   <w:abstractNum w:abstractNumId="0" w15:restartNumberingAfterBreak="0">
+    <w:nsid w:val="288E013F"/>
+    <w:multiLevelType w:val="hybridMultilevel"/>
+    <w:tmpl w:val="FE48AA36"/>
+    <w:lvl w:ilvl="0" w:tplc="04160001">
+      <w:start w:val="1"/>
+      <w:numFmt w:val="bullet"/>
+      <w:lvlText w:val=""/>
+      <w:lvlJc w:val="left"/>
+      <w:pPr>
+        <w:ind w:left="720" w:hanging="360"/>
+      </w:pPr>
+      <w:rPr>
+        <w:rFonts w:ascii="Symbol" w:hAnsi="Symbol" w:hint="default"/>
+      </w:rPr>
+    </w:lvl>
+    <w:lvl w:ilvl="1" w:tplc="04160003" w:tentative="1">
+      <w:start w:val="1"/>
+      <w:numFmt w:val="bullet"/>
+      <w:lvlText w:val="o"/>
+      <w:lvlJc w:val="left"/>
+      <w:pPr>
+        <w:ind w:left="1440" w:hanging="360"/>
+      </w:pPr>
+      <w:rPr>
+        <w:rFonts w:ascii="Courier New" w:hAnsi="Courier New" w:cs="Courier New" w:hint="default"/>
+      </w:rPr>
+    </w:lvl>
+    <w:lvl w:ilvl="2" w:tplc="04160005" w:tentative="1">
+      <w:start w:val="1"/>
+      <w:numFmt w:val="bullet"/>
+      <w:lvlText w:val=""/>
+      <w:lvlJc w:val="left"/>
+      <w:pPr>
+        <w:ind w:left="2160" w:hanging="360"/>
+      </w:pPr>
+      <w:rPr>
+        <w:rFonts w:ascii="Wingdings" w:hAnsi="Wingdings" w:hint="default"/>
+      </w:rPr>
+    </w:lvl>
+    <w:lvl w:ilvl="3" w:tplc="04160001" w:tentative="1">
+      <w:start w:val="1"/>
+      <w:numFmt w:val="bullet"/>
+      <w:lvlText w:val=""/>
+      <w:lvlJc w:val="left"/>
+      <w:pPr>
+        <w:ind w:left="2880" w:hanging="360"/>
+      </w:pPr>
+      <w:rPr>
+        <w:rFonts w:ascii="Symbol" w:hAnsi="Symbol" w:hint="default"/>
+      </w:rPr>
+    </w:lvl>
+    <w:lvl w:ilvl="4" w:tplc="04160003" w:tentative="1">
+      <w:start w:val="1"/>
+      <w:numFmt w:val="bullet"/>
+      <w:lvlText w:val="o"/>
+      <w:lvlJc w:val="left"/>
+      <w:pPr>
+        <w:ind w:left="3600" w:hanging="360"/>
+      </w:pPr>
+      <w:rPr>
+        <w:rFonts w:ascii="Courier New" w:hAnsi="Courier New" w:cs="Courier New" w:hint="default"/>
+      </w:rPr>
+    </w:lvl>
+    <w:lvl w:ilvl="5" w:tplc="04160005" w:tentative="1">
+      <w:start w:val="1"/>
+      <w:numFmt w:val="bullet"/>
+      <w:lvlText w:val=""/>
+      <w:lvlJc w:val="left"/>
+      <w:pPr>
+        <w:ind w:left="4320" w:hanging="360"/>
+      </w:pPr>
+      <w:rPr>
+        <w:rFonts w:ascii="Wingdings" w:hAnsi="Wingdings" w:hint="default"/>
+      </w:rPr>
+    </w:lvl>
+    <w:lvl w:ilvl="6" w:tplc="04160001" w:tentative="1">
+      <w:start w:val="1"/>
+      <w:numFmt w:val="bullet"/>
+      <w:lvlText w:val=""/>
+      <w:lvlJc w:val="left"/>
+      <w:pPr>
+        <w:ind w:left="5040" w:hanging="360"/>
+      </w:pPr>
+      <w:rPr>
+        <w:rFonts w:ascii="Symbol" w:hAnsi="Symbol" w:hint="default"/>
+      </w:rPr>
+    </w:lvl>
+    <w:lvl w:ilvl="7" w:tplc="04160003" w:tentative="1">
+      <w:start w:val="1"/>
+      <w:numFmt w:val="bullet"/>
+      <w:lvlText w:val="o"/>
+      <w:lvlJc w:val="left"/>
+      <w:pPr>
+        <w:ind w:left="5760" w:hanging="360"/>
+      </w:pPr>
+      <w:rPr>
+        <w:rFonts w:ascii="Courier New" w:hAnsi="Courier New" w:cs="Courier New" w:hint="default"/>
+      </w:rPr>
+    </w:lvl>
+    <w:lvl w:ilvl="8" w:tplc="04160005" w:tentative="1">
+      <w:start w:val="1"/>
+      <w:numFmt w:val="bullet"/>
+      <w:lvlText w:val=""/>
+      <w:lvlJc w:val="left"/>
+      <w:pPr>
+        <w:ind w:left="6480" w:hanging="360"/>
+      </w:pPr>
+      <w:rPr>
+        <w:rFonts w:ascii="Wingdings" w:hAnsi="Wingdings" w:hint="default"/>
+      </w:rPr>
+    </w:lvl>
+  </w:abstractNum>
+  <w:abstractNum w:abstractNumId="1" w15:restartNumberingAfterBreak="0">
+    <w:nsid w:val="28B01214"/>
+    <w:multiLevelType w:val="hybridMultilevel"/>
+    <w:tmpl w:val="416C5FFE"/>
+    <w:lvl w:ilvl="0" w:tplc="04160001">
+      <w:start w:val="1"/>
+      <w:numFmt w:val="bullet"/>
+      <w:lvlText w:val=""/>
+      <w:lvlJc w:val="left"/>
+      <w:pPr>
+        <w:ind w:left="720" w:hanging="360"/>
+      </w:pPr>
+      <w:rPr>
+        <w:rFonts w:ascii="Symbol" w:hAnsi="Symbol" w:hint="default"/>
+      </w:rPr>
+    </w:lvl>
+    <w:lvl w:ilvl="1" w:tplc="04160003" w:tentative="1">
+      <w:start w:val="1"/>
+      <w:numFmt w:val="bullet"/>
+      <w:lvlText w:val="o"/>
+      <w:lvlJc w:val="left"/>
+      <w:pPr>
+        <w:ind w:left="1440" w:hanging="360"/>
+      </w:pPr>
+      <w:rPr>
+        <w:rFonts w:ascii="Courier New" w:hAnsi="Courier New" w:cs="Courier New" w:hint="default"/>
+      </w:rPr>
+    </w:lvl>
+    <w:lvl w:ilvl="2" w:tplc="04160005" w:tentative="1">
+      <w:start w:val="1"/>
+      <w:numFmt w:val="bullet"/>
+      <w:lvlText w:val=""/>
+      <w:lvlJc w:val="left"/>
+      <w:pPr>
+        <w:ind w:left="2160" w:hanging="360"/>
+      </w:pPr>
+      <w:rPr>
+        <w:rFonts w:ascii="Wingdings" w:hAnsi="Wingdings" w:hint="default"/>
+      </w:rPr>
+    </w:lvl>
+    <w:lvl w:ilvl="3" w:tplc="04160001" w:tentative="1">
+      <w:start w:val="1"/>
+      <w:numFmt w:val="bullet"/>
+      <w:lvlText w:val=""/>
+      <w:lvlJc w:val="left"/>
+      <w:pPr>
+        <w:ind w:left="2880" w:hanging="360"/>
+      </w:pPr>
+      <w:rPr>
+        <w:rFonts w:ascii="Symbol" w:hAnsi="Symbol" w:hint="default"/>
+      </w:rPr>
+    </w:lvl>
+    <w:lvl w:ilvl="4" w:tplc="04160003" w:tentative="1">
+      <w:start w:val="1"/>
+      <w:numFmt w:val="bullet"/>
+      <w:lvlText w:val="o"/>
+      <w:lvlJc w:val="left"/>
+      <w:pPr>
+        <w:ind w:left="3600" w:hanging="360"/>
+      </w:pPr>
+      <w:rPr>
+        <w:rFonts w:ascii="Courier New" w:hAnsi="Courier New" w:cs="Courier New" w:hint="default"/>
+      </w:rPr>
+    </w:lvl>
+    <w:lvl w:ilvl="5" w:tplc="04160005" w:tentative="1">
+      <w:start w:val="1"/>
+      <w:numFmt w:val="bullet"/>
+      <w:lvlText w:val=""/>
+      <w:lvlJc w:val="left"/>
+      <w:pPr>
+        <w:ind w:left="4320" w:hanging="360"/>
+      </w:pPr>
+      <w:rPr>
+        <w:rFonts w:ascii="Wingdings" w:hAnsi="Wingdings" w:hint="default"/>
+      </w:rPr>
+    </w:lvl>
+    <w:lvl w:ilvl="6" w:tplc="04160001" w:tentative="1">
+      <w:start w:val="1"/>
+      <w:numFmt w:val="bullet"/>
+      <w:lvlText w:val=""/>
+      <w:lvlJc w:val="left"/>
+      <w:pPr>
+        <w:ind w:left="5040" w:hanging="360"/>
+      </w:pPr>
+      <w:rPr>
+        <w:rFonts w:ascii="Symbol" w:hAnsi="Symbol" w:hint="default"/>
+      </w:rPr>
+    </w:lvl>
+    <w:lvl w:ilvl="7" w:tplc="04160003" w:tentative="1">
+      <w:start w:val="1"/>
+      <w:numFmt w:val="bullet"/>
+      <w:lvlText w:val="o"/>
+      <w:lvlJc w:val="left"/>
+      <w:pPr>
+        <w:ind w:left="5760" w:hanging="360"/>
+      </w:pPr>
+      <w:rPr>
+        <w:rFonts w:ascii="Courier New" w:hAnsi="Courier New" w:cs="Courier New" w:hint="default"/>
+      </w:rPr>
+    </w:lvl>
+    <w:lvl w:ilvl="8" w:tplc="04160005" w:tentative="1">
+      <w:start w:val="1"/>
+      <w:numFmt w:val="bullet"/>
+      <w:lvlText w:val=""/>
+      <w:lvlJc w:val="left"/>
+      <w:pPr>
+        <w:ind w:left="6480" w:hanging="360"/>
+      </w:pPr>
+      <w:rPr>
+        <w:rFonts w:ascii="Wingdings" w:hAnsi="Wingdings" w:hint="default"/>
+      </w:rPr>
+    </w:lvl>
+  </w:abstractNum>
+  <w:abstractNum w:abstractNumId="2" w15:restartNumberingAfterBreak="0">
     <w:nsid w:val="2A0E0A82"/>
     <w:multiLevelType w:val="hybridMultilevel"/>
     <w:tmpl w:val="A2F04D64"/>
@@ -1306,7 +1848,7 @@
       </w:rPr>
     </w:lvl>
   </w:abstractNum>
-  <w:abstractNum w:abstractNumId="1" w15:restartNumberingAfterBreak="0">
+  <w:abstractNum w:abstractNumId="3" w15:restartNumberingAfterBreak="0">
     <w:nsid w:val="34560939"/>
     <w:multiLevelType w:val="hybridMultilevel"/>
     <w:tmpl w:val="F698E930"/>
@@ -1419,7 +1961,7 @@
       </w:rPr>
     </w:lvl>
   </w:abstractNum>
-  <w:abstractNum w:abstractNumId="2" w15:restartNumberingAfterBreak="0">
+  <w:abstractNum w:abstractNumId="4" w15:restartNumberingAfterBreak="0">
     <w:nsid w:val="491D2662"/>
     <w:multiLevelType w:val="hybridMultilevel"/>
     <w:tmpl w:val="88989B68"/>
@@ -1532,7 +2074,7 @@
       </w:rPr>
     </w:lvl>
   </w:abstractNum>
-  <w:abstractNum w:abstractNumId="3" w15:restartNumberingAfterBreak="0">
+  <w:abstractNum w:abstractNumId="5" w15:restartNumberingAfterBreak="0">
     <w:nsid w:val="6CB8224B"/>
     <w:multiLevelType w:val="hybridMultilevel"/>
     <w:tmpl w:val="965276A4"/>
@@ -1646,16 +2188,22 @@
     </w:lvl>
   </w:abstractNum>
   <w:num w:numId="1">
+    <w:abstractNumId w:val="3"/>
+  </w:num>
+  <w:num w:numId="2">
+    <w:abstractNumId w:val="2"/>
+  </w:num>
+  <w:num w:numId="3">
+    <w:abstractNumId w:val="5"/>
+  </w:num>
+  <w:num w:numId="4">
+    <w:abstractNumId w:val="4"/>
+  </w:num>
+  <w:num w:numId="5">
     <w:abstractNumId w:val="1"/>
   </w:num>
-  <w:num w:numId="2">
+  <w:num w:numId="6">
     <w:abstractNumId w:val="0"/>
-  </w:num>
-  <w:num w:numId="3">
-    <w:abstractNumId w:val="3"/>
-  </w:num>
-  <w:num w:numId="4">
-    <w:abstractNumId w:val="2"/>
   </w:num>
 </w:numbering>
 </file>

</xml_diff>

<commit_message>
Aula 3 de Banco de Dados
</commit_message>
<xml_diff>
--- a/Banco de Dados.docx
+++ b/Banco de Dados.docx
@@ -1202,8 +1202,6 @@
         </w:rPr>
         <w:t>Algo importante para o usuário ou empresa que</w:t>
       </w:r>
-      <w:bookmarkStart w:id="0" w:name="_GoBack"/>
-      <w:bookmarkEnd w:id="0"/>
     </w:p>
     <w:p>
       <w:pPr>
@@ -1496,6 +1494,589 @@
         </w:rPr>
         <w:t>Coluna = Atributos: armazena e descreve uma característica de um ser</w:t>
       </w:r>
+    </w:p>
+    <w:p>
+      <w:pPr>
+        <w:rPr>
+          <w:rFonts w:ascii="Times New Roman" w:hAnsi="Times New Roman" w:cs="Times New Roman"/>
+        </w:rPr>
+      </w:pPr>
+    </w:p>
+    <w:p>
+      <w:pPr>
+        <w:rPr>
+          <w:rFonts w:ascii="Times New Roman" w:hAnsi="Times New Roman" w:cs="Times New Roman"/>
+          <w:b/>
+          <w:sz w:val="28"/>
+        </w:rPr>
+      </w:pPr>
+      <w:r>
+        <w:rPr>
+          <w:rFonts w:ascii="Times New Roman" w:hAnsi="Times New Roman" w:cs="Times New Roman"/>
+          <w:b/>
+          <w:sz w:val="28"/>
+        </w:rPr>
+        <w:t>Cardinalidade</w:t>
+      </w:r>
+    </w:p>
+    <w:p>
+      <w:pPr>
+        <w:rPr>
+          <w:rFonts w:ascii="Times New Roman" w:hAnsi="Times New Roman" w:cs="Times New Roman"/>
+          <w:b/>
+          <w:sz w:val="24"/>
+        </w:rPr>
+      </w:pPr>
+    </w:p>
+    <w:p>
+      <w:pPr>
+        <w:rPr>
+          <w:rFonts w:ascii="Times New Roman" w:hAnsi="Times New Roman" w:cs="Times New Roman"/>
+        </w:rPr>
+      </w:pPr>
+      <w:r>
+        <w:rPr>
+          <w:rFonts w:ascii="Times New Roman" w:hAnsi="Times New Roman" w:cs="Times New Roman"/>
+        </w:rPr>
+        <w:t>Identificar a quantidade de itens que se relacionam entre entidades</w:t>
+      </w:r>
+    </w:p>
+    <w:p>
+      <w:pPr>
+        <w:rPr>
+          <w:rFonts w:ascii="Times New Roman" w:hAnsi="Times New Roman" w:cs="Times New Roman"/>
+        </w:rPr>
+      </w:pPr>
+      <w:r>
+        <w:rPr>
+          <w:rFonts w:ascii="Times New Roman" w:hAnsi="Times New Roman" w:cs="Times New Roman"/>
+        </w:rPr>
+        <w:t>Teoria dos conjuntos é a base de banco de dados relacionais</w:t>
+      </w:r>
+    </w:p>
+    <w:p>
+      <w:pPr>
+        <w:rPr>
+          <w:rFonts w:ascii="Times New Roman" w:hAnsi="Times New Roman" w:cs="Times New Roman"/>
+        </w:rPr>
+      </w:pPr>
+    </w:p>
+    <w:p>
+      <w:pPr>
+        <w:rPr>
+          <w:rFonts w:ascii="Times New Roman" w:hAnsi="Times New Roman" w:cs="Times New Roman"/>
+          <w:b/>
+          <w:sz w:val="24"/>
+        </w:rPr>
+      </w:pPr>
+      <w:r>
+        <w:rPr>
+          <w:rFonts w:ascii="Times New Roman" w:hAnsi="Times New Roman" w:cs="Times New Roman"/>
+          <w:b/>
+          <w:sz w:val="24"/>
+        </w:rPr>
+        <w:t>Cardinalidade mínima</w:t>
+      </w:r>
+    </w:p>
+    <w:p>
+      <w:pPr>
+        <w:rPr>
+          <w:rFonts w:ascii="Times New Roman" w:hAnsi="Times New Roman" w:cs="Times New Roman"/>
+          <w:sz w:val="24"/>
+        </w:rPr>
+      </w:pPr>
+      <w:r>
+        <w:rPr>
+          <w:rFonts w:ascii="Times New Roman" w:hAnsi="Times New Roman" w:cs="Times New Roman"/>
+          <w:sz w:val="24"/>
+        </w:rPr>
+        <w:t>Pergunta-se para uma entidade para poder determinar a cardinalidade da outra entidade</w:t>
+      </w:r>
+    </w:p>
+    <w:p>
+      <w:pPr>
+        <w:rPr>
+          <w:rFonts w:ascii="Times New Roman" w:hAnsi="Times New Roman" w:cs="Times New Roman"/>
+          <w:sz w:val="24"/>
+        </w:rPr>
+      </w:pPr>
+      <w:r>
+        <w:rPr>
+          <w:rFonts w:ascii="Times New Roman" w:hAnsi="Times New Roman" w:cs="Times New Roman"/>
+          <w:sz w:val="24"/>
+        </w:rPr>
+        <w:lastRenderedPageBreak/>
+        <w:t xml:space="preserve">Perguntas: obrigatoriedade, posse, </w:t>
+      </w:r>
+    </w:p>
+    <w:p>
+      <w:pPr>
+        <w:rPr>
+          <w:rFonts w:ascii="Times New Roman" w:hAnsi="Times New Roman" w:cs="Times New Roman"/>
+          <w:sz w:val="24"/>
+        </w:rPr>
+      </w:pPr>
+    </w:p>
+    <w:p>
+      <w:pPr>
+        <w:rPr>
+          <w:rFonts w:ascii="Times New Roman" w:hAnsi="Times New Roman" w:cs="Times New Roman"/>
+          <w:sz w:val="24"/>
+        </w:rPr>
+      </w:pPr>
+      <w:r>
+        <w:rPr>
+          <w:rFonts w:ascii="Times New Roman" w:hAnsi="Times New Roman" w:cs="Times New Roman"/>
+          <w:sz w:val="24"/>
+        </w:rPr>
+        <w:t>ID é a chave primária (PK). Sempre levará a chave primária para a outra tabela para poder relacionar as entidades</w:t>
+      </w:r>
+    </w:p>
+    <w:p>
+      <w:pPr>
+        <w:rPr>
+          <w:rFonts w:ascii="Times New Roman" w:hAnsi="Times New Roman" w:cs="Times New Roman"/>
+          <w:sz w:val="24"/>
+        </w:rPr>
+      </w:pPr>
+    </w:p>
+    <w:p>
+      <w:pPr>
+        <w:rPr>
+          <w:rFonts w:ascii="Times New Roman" w:hAnsi="Times New Roman" w:cs="Times New Roman"/>
+          <w:sz w:val="24"/>
+        </w:rPr>
+      </w:pPr>
+      <w:r>
+        <w:rPr>
+          <w:rFonts w:ascii="Times New Roman" w:hAnsi="Times New Roman" w:cs="Times New Roman"/>
+          <w:sz w:val="24"/>
+        </w:rPr>
+        <w:t xml:space="preserve">Mínimo apenas para representar obrigatoriedade. </w:t>
+      </w:r>
+    </w:p>
+    <w:p>
+      <w:pPr>
+        <w:rPr>
+          <w:rFonts w:ascii="Times New Roman" w:hAnsi="Times New Roman" w:cs="Times New Roman"/>
+          <w:sz w:val="24"/>
+        </w:rPr>
+      </w:pPr>
+      <w:r>
+        <w:rPr>
+          <w:rFonts w:ascii="Times New Roman" w:hAnsi="Times New Roman" w:cs="Times New Roman"/>
+          <w:sz w:val="24"/>
+        </w:rPr>
+        <w:t xml:space="preserve">Sempre o lado com N vai receber a chave estrangeira. </w:t>
+      </w:r>
+    </w:p>
+    <w:p>
+      <w:pPr>
+        <w:rPr>
+          <w:rFonts w:ascii="Times New Roman" w:hAnsi="Times New Roman" w:cs="Times New Roman"/>
+          <w:sz w:val="24"/>
+        </w:rPr>
+      </w:pPr>
+      <w:r>
+        <w:rPr>
+          <w:rFonts w:ascii="Times New Roman" w:hAnsi="Times New Roman" w:cs="Times New Roman"/>
+          <w:sz w:val="24"/>
+        </w:rPr>
+        <w:t>Quando tiver 1:1, sempre se pergunte se deveria ter essa tabela e transformar em uma coluna. Nesse caso, o lado para onde vai a chave não faz muita diferença</w:t>
+      </w:r>
+    </w:p>
+    <w:p>
+      <w:pPr>
+        <w:rPr>
+          <w:rFonts w:ascii="Times New Roman" w:hAnsi="Times New Roman" w:cs="Times New Roman"/>
+          <w:sz w:val="24"/>
+        </w:rPr>
+      </w:pPr>
+      <w:r>
+        <w:rPr>
+          <w:rFonts w:ascii="Times New Roman" w:hAnsi="Times New Roman" w:cs="Times New Roman"/>
+          <w:sz w:val="24"/>
+        </w:rPr>
+        <w:t>N:N pode gerar redundância. Nesse caso, cria-se uma nova tabela, chamada de entidade associativa</w:t>
+      </w:r>
+    </w:p>
+    <w:p>
+      <w:pPr>
+        <w:rPr>
+          <w:rFonts w:ascii="Times New Roman" w:hAnsi="Times New Roman" w:cs="Times New Roman"/>
+        </w:rPr>
+      </w:pPr>
+      <w:bookmarkStart w:id="0" w:name="_GoBack"/>
+    </w:p>
+    <w:p>
+      <w:pPr>
+        <w:rPr>
+          <w:rFonts w:ascii="Times New Roman" w:hAnsi="Times New Roman" w:cs="Times New Roman"/>
+        </w:rPr>
+      </w:pPr>
+      <w:r>
+        <w:rPr>
+          <w:rFonts w:ascii="Times New Roman" w:hAnsi="Times New Roman" w:cs="Times New Roman"/>
+        </w:rPr>
+        <w:t>Anatomia da Integridade</w:t>
+      </w:r>
+    </w:p>
+    <w:p>
+      <w:pPr>
+        <w:rPr>
+          <w:rFonts w:ascii="Times New Roman" w:hAnsi="Times New Roman" w:cs="Times New Roman"/>
+        </w:rPr>
+      </w:pPr>
+    </w:p>
+    <w:p>
+      <w:pPr>
+        <w:rPr>
+          <w:rFonts w:ascii="Times New Roman" w:hAnsi="Times New Roman" w:cs="Times New Roman"/>
+        </w:rPr>
+      </w:pPr>
+      <w:r>
+        <w:rPr>
+          <w:rFonts w:ascii="Times New Roman" w:hAnsi="Times New Roman" w:cs="Times New Roman"/>
+        </w:rPr>
+        <w:t>O domínio inclui não somente o conceito de impor o tipo de dado, mas também os valores permitidos na coluna</w:t>
+      </w:r>
+    </w:p>
+    <w:p>
+      <w:pPr>
+        <w:rPr>
+          <w:rFonts w:ascii="Times New Roman" w:hAnsi="Times New Roman" w:cs="Times New Roman"/>
+        </w:rPr>
+      </w:pPr>
+    </w:p>
+    <w:p>
+      <w:pPr>
+        <w:rPr>
+          <w:rFonts w:ascii="Times New Roman" w:hAnsi="Times New Roman" w:cs="Times New Roman"/>
+        </w:rPr>
+      </w:pPr>
+      <w:r>
+        <w:rPr>
+          <w:rFonts w:ascii="Times New Roman" w:hAnsi="Times New Roman" w:cs="Times New Roman"/>
+        </w:rPr>
+        <w:t>Sequências de Texto: CHAR vs. VARCHAR</w:t>
+      </w:r>
+    </w:p>
+    <w:p>
+      <w:pPr>
+        <w:rPr>
+          <w:rFonts w:ascii="Times New Roman" w:hAnsi="Times New Roman" w:cs="Times New Roman"/>
+        </w:rPr>
+      </w:pPr>
+    </w:p>
+    <w:p>
+      <w:pPr>
+        <w:rPr>
+          <w:rFonts w:ascii="Times New Roman" w:hAnsi="Times New Roman" w:cs="Times New Roman"/>
+        </w:rPr>
+      </w:pPr>
+      <w:r>
+        <w:rPr>
+          <w:rFonts w:ascii="Times New Roman" w:hAnsi="Times New Roman" w:cs="Times New Roman"/>
+        </w:rPr>
+        <w:t xml:space="preserve">Ambos </w:t>
+      </w:r>
+      <w:proofErr w:type="spellStart"/>
+      <w:r>
+        <w:rPr>
+          <w:rFonts w:ascii="Times New Roman" w:hAnsi="Times New Roman" w:cs="Times New Roman"/>
+        </w:rPr>
+        <w:t>com^rm</w:t>
+      </w:r>
+      <w:proofErr w:type="spellEnd"/>
+      <w:r>
+        <w:rPr>
+          <w:rFonts w:ascii="Times New Roman" w:hAnsi="Times New Roman" w:cs="Times New Roman"/>
+        </w:rPr>
+        <w:t xml:space="preserve"> caracteres ASCIT (limite comum de 255). A escolha define como a memória do servidor é alocada. </w:t>
+      </w:r>
+    </w:p>
+    <w:p>
+      <w:pPr>
+        <w:rPr>
+          <w:rFonts w:ascii="Times New Roman" w:hAnsi="Times New Roman" w:cs="Times New Roman"/>
+        </w:rPr>
+      </w:pPr>
+      <w:r>
+        <w:rPr>
+          <w:rFonts w:ascii="Times New Roman" w:hAnsi="Times New Roman" w:cs="Times New Roman"/>
+        </w:rPr>
+        <w:t>Exemplo de sintaxe: ‘Olá’ (sempre em aspas simples)</w:t>
+      </w:r>
+    </w:p>
+    <w:p>
+      <w:pPr>
+        <w:rPr>
+          <w:rFonts w:ascii="Times New Roman" w:hAnsi="Times New Roman" w:cs="Times New Roman"/>
+        </w:rPr>
+      </w:pPr>
+    </w:p>
+    <w:p>
+      <w:pPr>
+        <w:rPr>
+          <w:rFonts w:ascii="Times New Roman" w:hAnsi="Times New Roman" w:cs="Times New Roman"/>
+        </w:rPr>
+      </w:pPr>
+      <w:r>
+        <w:rPr>
+          <w:rFonts w:ascii="Times New Roman" w:hAnsi="Times New Roman" w:cs="Times New Roman"/>
+        </w:rPr>
+        <w:t>CHAR(N): Tamanho Fixo</w:t>
+      </w:r>
+    </w:p>
+    <w:p>
+      <w:pPr>
+        <w:rPr>
+          <w:rFonts w:ascii="Times New Roman" w:hAnsi="Times New Roman" w:cs="Times New Roman"/>
+        </w:rPr>
+      </w:pPr>
+      <w:r>
+        <w:rPr>
+          <w:rFonts w:ascii="Times New Roman" w:hAnsi="Times New Roman" w:cs="Times New Roman"/>
+        </w:rPr>
+        <w:t xml:space="preserve">Ocupa exatamente N Bytes, independentemente do uso. </w:t>
+      </w:r>
+    </w:p>
+    <w:p>
+      <w:pPr>
+        <w:rPr>
+          <w:rFonts w:ascii="Times New Roman" w:hAnsi="Times New Roman" w:cs="Times New Roman"/>
+        </w:rPr>
+      </w:pPr>
+      <w:r>
+        <w:rPr>
+          <w:rFonts w:ascii="Times New Roman" w:hAnsi="Times New Roman" w:cs="Times New Roman"/>
+        </w:rPr>
+        <w:t>VARCHAR(N): Tamanho Variável</w:t>
+      </w:r>
+    </w:p>
+    <w:p>
+      <w:pPr>
+        <w:rPr>
+          <w:rFonts w:ascii="Times New Roman" w:hAnsi="Times New Roman" w:cs="Times New Roman"/>
+        </w:rPr>
+      </w:pPr>
+      <w:r>
+        <w:rPr>
+          <w:rFonts w:ascii="Times New Roman" w:hAnsi="Times New Roman" w:cs="Times New Roman"/>
+        </w:rPr>
+        <w:t>Ocupa a quantidade usada + 1 Byte extra para registro de tamanho</w:t>
+      </w:r>
+    </w:p>
+    <w:p>
+      <w:pPr>
+        <w:rPr>
+          <w:rFonts w:ascii="Times New Roman" w:hAnsi="Times New Roman" w:cs="Times New Roman"/>
+        </w:rPr>
+      </w:pPr>
+    </w:p>
+    <w:p>
+      <w:pPr>
+        <w:rPr>
+          <w:rFonts w:ascii="Times New Roman" w:hAnsi="Times New Roman" w:cs="Times New Roman"/>
+        </w:rPr>
+      </w:pPr>
+      <w:r>
+        <w:rPr>
+          <w:rFonts w:ascii="Times New Roman" w:hAnsi="Times New Roman" w:cs="Times New Roman"/>
+        </w:rPr>
+        <w:t>Dados numéricos</w:t>
+      </w:r>
+    </w:p>
+    <w:p>
+      <w:pPr>
+        <w:rPr>
+          <w:rFonts w:ascii="Times New Roman" w:hAnsi="Times New Roman" w:cs="Times New Roman"/>
+        </w:rPr>
+      </w:pPr>
+    </w:p>
+    <w:p>
+      <w:pPr>
+        <w:rPr>
+          <w:rFonts w:ascii="Times New Roman" w:hAnsi="Times New Roman" w:cs="Times New Roman"/>
+        </w:rPr>
+      </w:pPr>
+      <w:r>
+        <w:rPr>
+          <w:rFonts w:ascii="Times New Roman" w:hAnsi="Times New Roman" w:cs="Times New Roman"/>
+        </w:rPr>
+        <w:t>INTEGER: São valores inteiros, positivos e negativos.</w:t>
+      </w:r>
+    </w:p>
+    <w:p>
+      <w:pPr>
+        <w:rPr>
+          <w:rFonts w:ascii="Times New Roman" w:hAnsi="Times New Roman" w:cs="Times New Roman"/>
+        </w:rPr>
+      </w:pPr>
+      <w:r>
+        <w:rPr>
+          <w:rFonts w:ascii="Times New Roman" w:hAnsi="Times New Roman" w:cs="Times New Roman"/>
+        </w:rPr>
+        <w:t>Vão de -2.147.483.648 a 2.147.483.648</w:t>
+      </w:r>
+    </w:p>
+    <w:p>
+      <w:pPr>
+        <w:rPr>
+          <w:rFonts w:ascii="Times New Roman" w:hAnsi="Times New Roman" w:cs="Times New Roman"/>
+        </w:rPr>
+      </w:pPr>
+      <w:r>
+        <w:rPr>
+          <w:rFonts w:ascii="Times New Roman" w:hAnsi="Times New Roman" w:cs="Times New Roman"/>
+        </w:rPr>
+        <w:t>Ocupam 4 Bytes</w:t>
+      </w:r>
+    </w:p>
+    <w:p>
+      <w:pPr>
+        <w:rPr>
+          <w:rFonts w:ascii="Times New Roman" w:hAnsi="Times New Roman" w:cs="Times New Roman"/>
+        </w:rPr>
+      </w:pPr>
+    </w:p>
+    <w:p>
+      <w:pPr>
+        <w:rPr>
+          <w:rFonts w:ascii="Times New Roman" w:hAnsi="Times New Roman" w:cs="Times New Roman"/>
+        </w:rPr>
+      </w:pPr>
+      <w:r>
+        <w:rPr>
+          <w:rFonts w:ascii="Times New Roman" w:hAnsi="Times New Roman" w:cs="Times New Roman"/>
+        </w:rPr>
+        <w:t>FLOAT(</w:t>
+      </w:r>
+      <w:proofErr w:type="spellStart"/>
+      <w:proofErr w:type="gramStart"/>
+      <w:r>
+        <w:rPr>
+          <w:rFonts w:ascii="Times New Roman" w:hAnsi="Times New Roman" w:cs="Times New Roman"/>
+        </w:rPr>
+        <w:t>n,n</w:t>
+      </w:r>
+      <w:proofErr w:type="spellEnd"/>
+      <w:proofErr w:type="gramEnd"/>
+      <w:r>
+        <w:rPr>
+          <w:rFonts w:ascii="Times New Roman" w:hAnsi="Times New Roman" w:cs="Times New Roman"/>
+        </w:rPr>
+        <w:t xml:space="preserve">) / DOUBLE: </w:t>
+      </w:r>
+    </w:p>
+    <w:p>
+      <w:pPr>
+        <w:rPr>
+          <w:rFonts w:ascii="Times New Roman" w:hAnsi="Times New Roman" w:cs="Times New Roman"/>
+        </w:rPr>
+      </w:pPr>
+    </w:p>
+    <w:p>
+      <w:pPr>
+        <w:rPr>
+          <w:rFonts w:ascii="Times New Roman" w:hAnsi="Times New Roman" w:cs="Times New Roman"/>
+        </w:rPr>
+      </w:pPr>
+    </w:p>
+    <w:p>
+      <w:pPr>
+        <w:rPr>
+          <w:rFonts w:ascii="Times New Roman" w:hAnsi="Times New Roman" w:cs="Times New Roman"/>
+        </w:rPr>
+      </w:pPr>
+      <w:r>
+        <w:rPr>
+          <w:rFonts w:ascii="Times New Roman" w:hAnsi="Times New Roman" w:cs="Times New Roman"/>
+        </w:rPr>
+        <w:t>Dados Temporais</w:t>
+      </w:r>
+    </w:p>
+    <w:p>
+      <w:pPr>
+        <w:rPr>
+          <w:rFonts w:ascii="Times New Roman" w:hAnsi="Times New Roman" w:cs="Times New Roman"/>
+        </w:rPr>
+      </w:pPr>
+      <w:r>
+        <w:rPr>
+          <w:rFonts w:ascii="Times New Roman" w:hAnsi="Times New Roman" w:cs="Times New Roman"/>
+        </w:rPr>
+        <w:t>DATE: [</w:t>
+      </w:r>
+      <w:proofErr w:type="spellStart"/>
+      <w:r>
+        <w:rPr>
+          <w:rFonts w:ascii="Times New Roman" w:hAnsi="Times New Roman" w:cs="Times New Roman"/>
+        </w:rPr>
+        <w:t>yyyy</w:t>
+      </w:r>
+      <w:proofErr w:type="spellEnd"/>
+      <w:r>
+        <w:rPr>
+          <w:rFonts w:ascii="Times New Roman" w:hAnsi="Times New Roman" w:cs="Times New Roman"/>
+        </w:rPr>
+        <w:t>-mm-</w:t>
+      </w:r>
+      <w:proofErr w:type="spellStart"/>
+      <w:r>
+        <w:rPr>
+          <w:rFonts w:ascii="Times New Roman" w:hAnsi="Times New Roman" w:cs="Times New Roman"/>
+        </w:rPr>
+        <w:t>dd</w:t>
+      </w:r>
+      <w:proofErr w:type="spellEnd"/>
+      <w:r>
+        <w:rPr>
+          <w:rFonts w:ascii="Times New Roman" w:hAnsi="Times New Roman" w:cs="Times New Roman"/>
+        </w:rPr>
+        <w:t>]</w:t>
+      </w:r>
+    </w:p>
+    <w:p>
+      <w:pPr>
+        <w:rPr>
+          <w:rFonts w:ascii="Times New Roman" w:hAnsi="Times New Roman" w:cs="Times New Roman"/>
+        </w:rPr>
+      </w:pPr>
+      <w:r>
+        <w:rPr>
+          <w:rFonts w:ascii="Times New Roman" w:hAnsi="Times New Roman" w:cs="Times New Roman"/>
+        </w:rPr>
+        <w:t>Ocupa 3 Bytes</w:t>
+      </w:r>
+    </w:p>
+    <w:p>
+      <w:pPr>
+        <w:rPr>
+          <w:rFonts w:ascii="Times New Roman" w:hAnsi="Times New Roman" w:cs="Times New Roman"/>
+        </w:rPr>
+      </w:pPr>
+    </w:p>
+    <w:p>
+      <w:pPr>
+        <w:rPr>
+          <w:rFonts w:ascii="Times New Roman" w:hAnsi="Times New Roman" w:cs="Times New Roman"/>
+        </w:rPr>
+      </w:pPr>
+      <w:r>
+        <w:rPr>
+          <w:rFonts w:ascii="Times New Roman" w:hAnsi="Times New Roman" w:cs="Times New Roman"/>
+        </w:rPr>
+        <w:t>CHECK: Transforma regras do mundo real em barreiras físicas no banco de dados</w:t>
+      </w:r>
+    </w:p>
+    <w:bookmarkEnd w:id="0"/>
+    <w:p>
+      <w:pPr>
+        <w:rPr>
+          <w:rFonts w:ascii="Times New Roman" w:hAnsi="Times New Roman" w:cs="Times New Roman"/>
+        </w:rPr>
+      </w:pPr>
     </w:p>
     <w:sectPr>
       <w:pgSz w:w="11906" w:h="16838"/>

</xml_diff>